<commit_message>
Refactor Amazon skill research inputs
</commit_message>
<xml_diff>
--- a/docs/Amazon Listing 自动文案 Skill 使用手册.docx
+++ b/docs/Amazon Listing 自动文案 Skill 使用手册.docx
@@ -4,2305 +4,1002 @@
   <w:body>
     <w:p>
       <w:pPr>
-        <w:spacing w:before="120" w:after="80"/>
+        <w:pStyle w:val="Title"/>
+        <w:spacing w:after="240"/>
+        <w:jc w:val="center"/>
       </w:pPr>
       <w:r>
-        <w:rPr>
-          <w:rFonts w:ascii="Microsoft YaHei" w:hAnsi="Microsoft YaHei" w:eastAsia="Microsoft YaHei"/>
-          <w:b/>
-          <w:color w:val="1F4E79"/>
-          <w:sz w:val="48"/>
-        </w:rPr>
-        <w:t>Amazon Listing 自动文案 Skill</w:t>
+        <w:t>Amazon Listing 自动文案 Skill 使用说明</w:t>
       </w:r>
     </w:p>
     <w:p>
       <w:pPr>
-        <w:spacing w:after="280"/>
+        <w:spacing w:after="80" w:line="259" w:lineRule="auto"/>
       </w:pPr>
       <w:r>
-        <w:rPr>
-          <w:rFonts w:ascii="Microsoft YaHei" w:hAnsi="Microsoft YaHei" w:eastAsia="Microsoft YaHei"/>
-          <w:color w:val="374151"/>
-          <w:sz w:val="26"/>
-        </w:rPr>
-        <w:t>运营使用手册：安装、调用、提示词模板与复核要点</w:t>
-      </w:r>
-    </w:p>
-    <w:tbl>
-      <w:tblPr>
-        <w:tblW w:type="auto" w:w="0"/>
-        <w:jc w:val="left"/>
-        <w:tblLayout w:type="fixed"/>
-        <w:tblLook w:firstColumn="1" w:firstRow="1" w:lastColumn="0" w:lastRow="0" w:noHBand="0" w:noVBand="1" w:val="04A0"/>
-      </w:tblPr>
-      <w:tblGrid>
-        <w:gridCol w:w="1728"/>
-        <w:gridCol w:w="7992"/>
-      </w:tblGrid>
-      <w:tr>
-        <w:tc>
-          <w:tcPr>
-            <w:tcW w:type="dxa" w:w="4896"/>
-            <w:tcBorders>
-              <w:top w:val="single" w:sz="4" w:space="0" w:color="D9E2EA"/>
-              <w:left w:val="single" w:sz="4" w:space="0" w:color="D9E2EA"/>
-              <w:bottom w:val="single" w:sz="4" w:space="0" w:color="D9E2EA"/>
-              <w:right w:val="single" w:sz="4" w:space="0" w:color="D9E2EA"/>
-            </w:tcBorders>
-            <w:tcMar>
-              <w:top w:w="100" w:type="dxa"/>
-              <w:start w:w="120" w:type="dxa"/>
-              <w:bottom w:w="100" w:type="dxa"/>
-              <w:end w:w="120" w:type="dxa"/>
-            </w:tcMar>
-            <w:vAlign w:val="center"/>
-            <w:shd w:fill="EAF3F8"/>
-          </w:tcPr>
-          <w:p>
-            <w:pPr>
-              <w:spacing w:after="0"/>
-            </w:pPr>
-            <w:r>
-              <w:rPr>
-                <w:rFonts w:ascii="Microsoft YaHei" w:hAnsi="Microsoft YaHei" w:eastAsia="Microsoft YaHei"/>
-                <w:b/>
-                <w:color w:val="1F4E79"/>
-                <w:sz w:val="20"/>
-              </w:rPr>
-              <w:t>适用对象</w:t>
-            </w:r>
-          </w:p>
-        </w:tc>
-        <w:tc>
-          <w:tcPr>
-            <w:tcW w:type="dxa" w:w="4896"/>
-            <w:tcBorders>
-              <w:top w:val="single" w:sz="4" w:space="0" w:color="D9E2EA"/>
-              <w:left w:val="single" w:sz="4" w:space="0" w:color="D9E2EA"/>
-              <w:bottom w:val="single" w:sz="4" w:space="0" w:color="D9E2EA"/>
-              <w:right w:val="single" w:sz="4" w:space="0" w:color="D9E2EA"/>
-            </w:tcBorders>
-            <w:tcMar>
-              <w:top w:w="100" w:type="dxa"/>
-              <w:start w:w="120" w:type="dxa"/>
-              <w:bottom w:w="100" w:type="dxa"/>
-              <w:end w:w="120" w:type="dxa"/>
-            </w:tcMar>
-            <w:vAlign w:val="center"/>
-            <w:shd w:fill="FFFFFF"/>
-          </w:tcPr>
-          <w:p>
-            <w:pPr>
-              <w:spacing w:after="0"/>
-            </w:pPr>
-            <w:r>
-              <w:rPr>
-                <w:rFonts w:ascii="Microsoft YaHei" w:hAnsi="Microsoft YaHei" w:eastAsia="Microsoft YaHei"/>
-                <w:sz w:val="20"/>
-              </w:rPr>
-              <w:t>运营、产品、跨境电商团队中需要快速生成 Amazon Listing 初稿的同事</w:t>
-            </w:r>
-          </w:p>
-        </w:tc>
-      </w:tr>
-      <w:tr>
-        <w:tc>
-          <w:tcPr>
-            <w:tcW w:type="dxa" w:w="4896"/>
-            <w:tcBorders>
-              <w:top w:val="single" w:sz="4" w:space="0" w:color="D9E2EA"/>
-              <w:left w:val="single" w:sz="4" w:space="0" w:color="D9E2EA"/>
-              <w:bottom w:val="single" w:sz="4" w:space="0" w:color="D9E2EA"/>
-              <w:right w:val="single" w:sz="4" w:space="0" w:color="D9E2EA"/>
-            </w:tcBorders>
-            <w:tcMar>
-              <w:top w:w="100" w:type="dxa"/>
-              <w:start w:w="120" w:type="dxa"/>
-              <w:bottom w:w="100" w:type="dxa"/>
-              <w:end w:w="120" w:type="dxa"/>
-            </w:tcMar>
-            <w:vAlign w:val="center"/>
-            <w:shd w:fill="EAF3F8"/>
-          </w:tcPr>
-          <w:p>
-            <w:pPr>
-              <w:spacing w:after="0"/>
-            </w:pPr>
-            <w:r>
-              <w:rPr>
-                <w:rFonts w:ascii="Microsoft YaHei" w:hAnsi="Microsoft YaHei" w:eastAsia="Microsoft YaHei"/>
-                <w:b/>
-                <w:color w:val="1F4E79"/>
-                <w:sz w:val="20"/>
-              </w:rPr>
-              <w:t>支持站点</w:t>
-            </w:r>
-          </w:p>
-        </w:tc>
-        <w:tc>
-          <w:tcPr>
-            <w:tcW w:type="dxa" w:w="4896"/>
-            <w:tcBorders>
-              <w:top w:val="single" w:sz="4" w:space="0" w:color="D9E2EA"/>
-              <w:left w:val="single" w:sz="4" w:space="0" w:color="D9E2EA"/>
-              <w:bottom w:val="single" w:sz="4" w:space="0" w:color="D9E2EA"/>
-              <w:right w:val="single" w:sz="4" w:space="0" w:color="D9E2EA"/>
-            </w:tcBorders>
-            <w:tcMar>
-              <w:top w:w="100" w:type="dxa"/>
-              <w:start w:w="120" w:type="dxa"/>
-              <w:bottom w:w="100" w:type="dxa"/>
-              <w:end w:w="120" w:type="dxa"/>
-            </w:tcMar>
-            <w:vAlign w:val="center"/>
-            <w:shd w:fill="FFFFFF"/>
-          </w:tcPr>
-          <w:p>
-            <w:pPr>
-              <w:spacing w:after="0"/>
-            </w:pPr>
-            <w:r>
-              <w:rPr>
-                <w:rFonts w:ascii="Microsoft YaHei" w:hAnsi="Microsoft YaHei" w:eastAsia="Microsoft YaHei"/>
-                <w:sz w:val="20"/>
-              </w:rPr>
-              <w:t>Amazon US、Amazon CA。不写站点时默认美国站。</w:t>
-            </w:r>
-          </w:p>
-        </w:tc>
-      </w:tr>
-      <w:tr>
-        <w:tc>
-          <w:tcPr>
-            <w:tcW w:type="dxa" w:w="4896"/>
-            <w:tcBorders>
-              <w:top w:val="single" w:sz="4" w:space="0" w:color="D9E2EA"/>
-              <w:left w:val="single" w:sz="4" w:space="0" w:color="D9E2EA"/>
-              <w:bottom w:val="single" w:sz="4" w:space="0" w:color="D9E2EA"/>
-              <w:right w:val="single" w:sz="4" w:space="0" w:color="D9E2EA"/>
-            </w:tcBorders>
-            <w:tcMar>
-              <w:top w:w="100" w:type="dxa"/>
-              <w:start w:w="120" w:type="dxa"/>
-              <w:bottom w:w="100" w:type="dxa"/>
-              <w:end w:w="120" w:type="dxa"/>
-            </w:tcMar>
-            <w:vAlign w:val="center"/>
-            <w:shd w:fill="EAF3F8"/>
-          </w:tcPr>
-          <w:p>
-            <w:pPr>
-              <w:spacing w:after="0"/>
-            </w:pPr>
-            <w:r>
-              <w:rPr>
-                <w:rFonts w:ascii="Microsoft YaHei" w:hAnsi="Microsoft YaHei" w:eastAsia="Microsoft YaHei"/>
-                <w:b/>
-                <w:color w:val="1F4E79"/>
-                <w:sz w:val="20"/>
-              </w:rPr>
-              <w:t>核心产出</w:t>
-            </w:r>
-          </w:p>
-        </w:tc>
-        <w:tc>
-          <w:tcPr>
-            <w:tcW w:type="dxa" w:w="4896"/>
-            <w:tcBorders>
-              <w:top w:val="single" w:sz="4" w:space="0" w:color="D9E2EA"/>
-              <w:left w:val="single" w:sz="4" w:space="0" w:color="D9E2EA"/>
-              <w:bottom w:val="single" w:sz="4" w:space="0" w:color="D9E2EA"/>
-              <w:right w:val="single" w:sz="4" w:space="0" w:color="D9E2EA"/>
-            </w:tcBorders>
-            <w:tcMar>
-              <w:top w:w="100" w:type="dxa"/>
-              <w:start w:w="120" w:type="dxa"/>
-              <w:bottom w:w="100" w:type="dxa"/>
-              <w:end w:w="120" w:type="dxa"/>
-            </w:tcMar>
-            <w:vAlign w:val="center"/>
-            <w:shd w:fill="FFFFFF"/>
-          </w:tcPr>
-          <w:p>
-            <w:pPr>
-              <w:spacing w:after="0"/>
-            </w:pPr>
-            <w:r>
-              <w:rPr>
-                <w:rFonts w:ascii="Microsoft YaHei" w:hAnsi="Microsoft YaHei" w:eastAsia="Microsoft YaHei"/>
-                <w:sz w:val="20"/>
-              </w:rPr>
-              <w:t>英文标题、五点、描述、后台搜索词；中文逐句对照；竞品依据与运营复核清单。</w:t>
-            </w:r>
-          </w:p>
-        </w:tc>
-      </w:tr>
-    </w:tbl>
-    <w:tbl>
-      <w:tblPr>
-        <w:tblW w:type="auto" w:w="0"/>
-        <w:jc w:val="left"/>
-        <w:tblLook w:firstColumn="1" w:firstRow="1" w:lastColumn="0" w:lastRow="0" w:noHBand="0" w:noVBand="1" w:val="04A0"/>
-      </w:tblPr>
-      <w:tblGrid>
-        <w:gridCol w:w="9792"/>
-      </w:tblGrid>
-      <w:tr>
-        <w:tc>
-          <w:tcPr>
-            <w:tcW w:type="dxa" w:w="9792"/>
-            <w:shd w:fill="EAF3F8"/>
-            <w:tcBorders>
-              <w:top w:val="single" w:sz="4" w:space="0" w:color="C9D6E2"/>
-              <w:left w:val="single" w:sz="4" w:space="0" w:color="C9D6E2"/>
-              <w:bottom w:val="single" w:sz="4" w:space="0" w:color="C9D6E2"/>
-              <w:right w:val="single" w:sz="4" w:space="0" w:color="C9D6E2"/>
-            </w:tcBorders>
-            <w:tcMar>
-              <w:top w:w="140" w:type="dxa"/>
-              <w:start w:w="180" w:type="dxa"/>
-              <w:bottom w:w="140" w:type="dxa"/>
-              <w:end w:w="180" w:type="dxa"/>
-            </w:tcMar>
-          </w:tcPr>
-          <w:p>
-            <w:pPr>
-              <w:spacing w:after="60"/>
-            </w:pPr>
-            <w:r>
-              <w:rPr>
-                <w:rFonts w:ascii="Microsoft YaHei" w:hAnsi="Microsoft YaHei" w:eastAsia="Microsoft YaHei"/>
-                <w:b/>
-                <w:color w:val="1F4E79"/>
-                <w:sz w:val="21"/>
-              </w:rPr>
-              <w:t>一句话说明</w:t>
-            </w:r>
-          </w:p>
-          <w:p>
-            <w:pPr>
-              <w:spacing w:after="0"/>
-            </w:pPr>
-            <w:r>
-              <w:rPr>
-                <w:rFonts w:ascii="Microsoft YaHei" w:hAnsi="Microsoft YaHei" w:eastAsia="Microsoft YaHei"/>
-                <w:sz w:val="20"/>
-              </w:rPr>
-              <w:t>这个 Skill 帮运营从一个产品名出发，自动参考 Amazon 前台竞品，生成更像美国本土 Listing 的英文主文案，并附中文逐句对照和复核清单。</w:t>
-            </w:r>
-          </w:p>
-        </w:tc>
-      </w:tr>
-    </w:tbl>
-    <w:p>
-      <w:pPr>
-        <w:pStyle w:val="Heading1"/>
-      </w:pPr>
-      <w:r>
-        <w:t>1. 第一次安装</w:t>
+        <w:t>这份文档给运营同事使用。你不需要懂代码，只要照着下面的话术在 Codex 里输入即可。</w:t>
       </w:r>
     </w:p>
     <w:p>
+      <w:pPr>
+        <w:pStyle w:val="Heading1"/>
+        <w:spacing w:before="200" w:after="80"/>
+      </w:pPr>
       <w:r>
-        <w:t>在 Codex 里输入下面这句话，安装完成后重启 Codex。</w:t>
-      </w:r>
-    </w:p>
-    <w:tbl>
-      <w:tblPr>
-        <w:tblW w:type="auto" w:w="0"/>
-        <w:jc w:val="left"/>
-        <w:tblLook w:firstColumn="1" w:firstRow="1" w:lastColumn="0" w:lastRow="0" w:noHBand="0" w:noVBand="1" w:val="04A0"/>
-      </w:tblPr>
-      <w:tblGrid>
-        <w:gridCol w:w="9792"/>
-      </w:tblGrid>
-      <w:tr>
-        <w:tc>
-          <w:tcPr>
-            <w:tcW w:type="dxa" w:w="9792"/>
-            <w:shd w:fill="F7F7F7"/>
-            <w:tcBorders>
-              <w:top w:val="single" w:sz="4" w:space="0" w:color="D1D5DB"/>
-              <w:left w:val="single" w:sz="4" w:space="0" w:color="D1D5DB"/>
-              <w:bottom w:val="single" w:sz="4" w:space="0" w:color="D1D5DB"/>
-              <w:right w:val="single" w:sz="4" w:space="0" w:color="D1D5DB"/>
-            </w:tcBorders>
-            <w:tcMar>
-              <w:top w:w="140" w:type="dxa"/>
-              <w:start w:w="180" w:type="dxa"/>
-              <w:bottom w:w="140" w:type="dxa"/>
-              <w:end w:w="180" w:type="dxa"/>
-            </w:tcMar>
-          </w:tcPr>
-          <w:p>
-            <w:pPr>
-              <w:spacing w:after="0"/>
-            </w:pPr>
-            <w:r>
-              <w:rPr>
-                <w:rFonts w:ascii="Consolas" w:hAnsi="Consolas" w:eastAsia="Consolas"/>
-                <w:color w:val="111827"/>
-                <w:sz w:val="19"/>
-              </w:rPr>
-              <w:t>帮我安装这个 skill：https://github.com/hejun6666/maimeng/tree/main/skills/amazon-listing-auto-copywriter</w:t>
-            </w:r>
-          </w:p>
-        </w:tc>
-      </w:tr>
-    </w:tbl>
-    <w:tbl>
-      <w:tblPr>
-        <w:tblW w:type="auto" w:w="0"/>
-        <w:jc w:val="left"/>
-        <w:tblLook w:firstColumn="1" w:firstRow="1" w:lastColumn="0" w:lastRow="0" w:noHBand="0" w:noVBand="1" w:val="04A0"/>
-      </w:tblPr>
-      <w:tblGrid>
-        <w:gridCol w:w="9792"/>
-      </w:tblGrid>
-      <w:tr>
-        <w:tc>
-          <w:tcPr>
-            <w:tcW w:type="dxa" w:w="9792"/>
-            <w:shd w:fill="F3F6F8"/>
-            <w:tcBorders>
-              <w:top w:val="single" w:sz="4" w:space="0" w:color="C9D6E2"/>
-              <w:left w:val="single" w:sz="4" w:space="0" w:color="C9D6E2"/>
-              <w:bottom w:val="single" w:sz="4" w:space="0" w:color="C9D6E2"/>
-              <w:right w:val="single" w:sz="4" w:space="0" w:color="C9D6E2"/>
-            </w:tcBorders>
-            <w:tcMar>
-              <w:top w:w="140" w:type="dxa"/>
-              <w:start w:w="180" w:type="dxa"/>
-              <w:bottom w:w="140" w:type="dxa"/>
-              <w:end w:w="180" w:type="dxa"/>
-            </w:tcMar>
-          </w:tcPr>
-          <w:p>
-            <w:pPr>
-              <w:spacing w:after="60"/>
-            </w:pPr>
-            <w:r>
-              <w:rPr>
-                <w:rFonts w:ascii="Microsoft YaHei" w:hAnsi="Microsoft YaHei" w:eastAsia="Microsoft YaHei"/>
-                <w:b/>
-                <w:color w:val="1F4E79"/>
-                <w:sz w:val="21"/>
-              </w:rPr>
-              <w:t>如果安装后调用不出来</w:t>
-            </w:r>
-          </w:p>
-          <w:p>
-            <w:pPr>
-              <w:spacing w:after="0"/>
-            </w:pPr>
-            <w:r>
-              <w:rPr>
-                <w:rFonts w:ascii="Microsoft YaHei" w:hAnsi="Microsoft YaHei" w:eastAsia="Microsoft YaHei"/>
-                <w:sz w:val="20"/>
-              </w:rPr>
-              <w:t>先重启 Codex。仍然不行时，确认安装地址是否复制完整，并确认仓库路径里包含 skills/amazon-listing-auto-copywriter。</w:t>
-            </w:r>
-          </w:p>
-        </w:tc>
-      </w:tr>
-    </w:tbl>
-    <w:p>
-      <w:pPr>
-        <w:pStyle w:val="Heading1"/>
-      </w:pPr>
-      <w:r>
-        <w:t>2. 日常怎么调用</w:t>
+        <w:t>这个 Skill 是干什么的</w:t>
       </w:r>
     </w:p>
     <w:p>
+      <w:pPr>
+        <w:spacing w:after="80" w:line="259" w:lineRule="auto"/>
+      </w:pPr>
       <w:r>
-        <w:t>最简单的方式是直接告诉 Codex 产品是什么。</w:t>
-      </w:r>
-    </w:p>
-    <w:tbl>
-      <w:tblPr>
-        <w:tblW w:type="auto" w:w="0"/>
-        <w:jc w:val="left"/>
-        <w:tblLook w:firstColumn="1" w:firstRow="1" w:lastColumn="0" w:lastRow="0" w:noHBand="0" w:noVBand="1" w:val="04A0"/>
-      </w:tblPr>
-      <w:tblGrid>
-        <w:gridCol w:w="9792"/>
-      </w:tblGrid>
-      <w:tr>
-        <w:tc>
-          <w:tcPr>
-            <w:tcW w:type="dxa" w:w="9792"/>
-            <w:shd w:fill="F7F7F7"/>
-            <w:tcBorders>
-              <w:top w:val="single" w:sz="4" w:space="0" w:color="D1D5DB"/>
-              <w:left w:val="single" w:sz="4" w:space="0" w:color="D1D5DB"/>
-              <w:bottom w:val="single" w:sz="4" w:space="0" w:color="D1D5DB"/>
-              <w:right w:val="single" w:sz="4" w:space="0" w:color="D1D5DB"/>
-            </w:tcBorders>
-            <w:tcMar>
-              <w:top w:w="140" w:type="dxa"/>
-              <w:start w:w="180" w:type="dxa"/>
-              <w:bottom w:w="140" w:type="dxa"/>
-              <w:end w:w="180" w:type="dxa"/>
-            </w:tcMar>
-          </w:tcPr>
-          <w:p>
-            <w:pPr>
-              <w:spacing w:after="0"/>
-            </w:pPr>
-            <w:r>
-              <w:rPr>
-                <w:rFonts w:ascii="Consolas" w:hAnsi="Consolas" w:eastAsia="Consolas"/>
-                <w:color w:val="111827"/>
-                <w:sz w:val="19"/>
-              </w:rPr>
-              <w:t>用 amazon-listing-auto-copywriter，产品是荧光笔</w:t>
-            </w:r>
-          </w:p>
-        </w:tc>
-      </w:tr>
-    </w:tbl>
-    <w:p>
-      <w:r>
-        <w:t>如果要指定站点，把站点写进去。</w:t>
-      </w:r>
-    </w:p>
-    <w:tbl>
-      <w:tblPr>
-        <w:tblW w:type="auto" w:w="0"/>
-        <w:jc w:val="left"/>
-        <w:tblLook w:firstColumn="1" w:firstRow="1" w:lastColumn="0" w:lastRow="0" w:noHBand="0" w:noVBand="1" w:val="04A0"/>
-      </w:tblPr>
-      <w:tblGrid>
-        <w:gridCol w:w="9792"/>
-      </w:tblGrid>
-      <w:tr>
-        <w:tc>
-          <w:tcPr>
-            <w:tcW w:type="dxa" w:w="9792"/>
-            <w:shd w:fill="F7F7F7"/>
-            <w:tcBorders>
-              <w:top w:val="single" w:sz="4" w:space="0" w:color="D1D5DB"/>
-              <w:left w:val="single" w:sz="4" w:space="0" w:color="D1D5DB"/>
-              <w:bottom w:val="single" w:sz="4" w:space="0" w:color="D1D5DB"/>
-              <w:right w:val="single" w:sz="4" w:space="0" w:color="D1D5DB"/>
-            </w:tcBorders>
-            <w:tcMar>
-              <w:top w:w="140" w:type="dxa"/>
-              <w:start w:w="180" w:type="dxa"/>
-              <w:bottom w:w="140" w:type="dxa"/>
-              <w:end w:w="180" w:type="dxa"/>
-            </w:tcMar>
-          </w:tcPr>
-          <w:p>
-            <w:pPr>
-              <w:spacing w:after="0"/>
-            </w:pPr>
-            <w:r>
-              <w:rPr>
-                <w:rFonts w:ascii="Consolas" w:hAnsi="Consolas" w:eastAsia="Consolas"/>
-                <w:color w:val="111827"/>
-                <w:sz w:val="19"/>
-              </w:rPr>
-              <w:t>用 amazon-listing-auto-copywriter，产品是婴儿围栏，美国站</w:t>
-            </w:r>
-          </w:p>
-          <w:p>
-            <w:pPr>
-              <w:spacing w:after="0"/>
-            </w:pPr>
-            <w:r>
-              <w:rPr>
-                <w:rFonts w:ascii="Consolas" w:hAnsi="Consolas" w:eastAsia="Consolas"/>
-                <w:color w:val="111827"/>
-                <w:sz w:val="19"/>
-              </w:rPr>
-              <w:t>用 amazon-listing-auto-copywriter，产品是儿童显微镜，加拿大站</w:t>
-            </w:r>
-          </w:p>
-        </w:tc>
-      </w:tr>
-    </w:tbl>
-    <w:p>
-      <w:pPr>
-        <w:pStyle w:val="Heading1"/>
-      </w:pPr>
-      <w:r>
-        <w:t>3. 推荐输入哪些产品信息</w:t>
+        <w:t>`amazon-listing-auto-copywriter` 用来生成 Amazon US / CA / UK / DE 站点的商品 Listing 文案。</w:t>
       </w:r>
     </w:p>
     <w:p>
       <w:pPr>
-        <w:spacing w:after="60"/>
-        <w:ind w:left="360" w:hanging="216"/>
+        <w:spacing w:after="80" w:line="259" w:lineRule="auto"/>
       </w:pPr>
       <w:r>
-        <w:rPr>
-          <w:rFonts w:ascii="Microsoft YaHei" w:hAnsi="Microsoft YaHei" w:eastAsia="Microsoft YaHei"/>
-          <w:b/>
-          <w:color w:val="1F4E79"/>
-          <w:sz w:val="21"/>
-        </w:rPr>
-        <w:t xml:space="preserve">• </w:t>
-      </w:r>
-      <w:r>
-        <w:rPr>
-          <w:rFonts w:ascii="Microsoft YaHei" w:hAnsi="Microsoft YaHei" w:eastAsia="Microsoft YaHei"/>
-          <w:sz w:val="21"/>
-        </w:rPr>
-        <w:t>产品名：必须写，哪怕只有中文品名也可以。</w:t>
+        <w:t>它会先自动抓取 Amazon 前台公开竞品信息，再输出：</w:t>
       </w:r>
     </w:p>
     <w:p>
       <w:pPr>
-        <w:spacing w:after="60"/>
-        <w:ind w:left="360" w:hanging="216"/>
+        <w:pStyle w:val="ListBullet"/>
+        <w:spacing w:after="30"/>
       </w:pPr>
       <w:r>
-        <w:rPr>
-          <w:rFonts w:ascii="Microsoft YaHei" w:hAnsi="Microsoft YaHei" w:eastAsia="Microsoft YaHei"/>
-          <w:b/>
-          <w:color w:val="1F4E79"/>
-          <w:sz w:val="21"/>
-        </w:rPr>
-        <w:t xml:space="preserve">• </w:t>
-      </w:r>
-      <w:r>
-        <w:rPr>
-          <w:rFonts w:ascii="Microsoft YaHei" w:hAnsi="Microsoft YaHei" w:eastAsia="Microsoft YaHei"/>
-          <w:sz w:val="21"/>
-        </w:rPr>
-        <w:t>站点：美国站或加拿大站；不写默认美国站。</w:t>
+        <w:t>可复制到 Amazon 的标题、五点、描述、后台搜索词</w:t>
       </w:r>
     </w:p>
     <w:p>
       <w:pPr>
-        <w:spacing w:after="60"/>
-        <w:ind w:left="360" w:hanging="216"/>
+        <w:pStyle w:val="ListBullet"/>
+        <w:spacing w:after="30"/>
       </w:pPr>
       <w:r>
-        <w:rPr>
-          <w:rFonts w:ascii="Microsoft YaHei" w:hAnsi="Microsoft YaHei" w:eastAsia="Microsoft YaHei"/>
-          <w:b/>
-          <w:color w:val="1F4E79"/>
-          <w:sz w:val="21"/>
-        </w:rPr>
-        <w:t xml:space="preserve">• </w:t>
-      </w:r>
-      <w:r>
-        <w:rPr>
-          <w:rFonts w:ascii="Microsoft YaHei" w:hAnsi="Microsoft YaHei" w:eastAsia="Microsoft YaHei"/>
-          <w:sz w:val="21"/>
-        </w:rPr>
-        <w:t>规格：数量、尺寸、颜色、材质、套装内容。</w:t>
+        <w:t>对应主文案的一对一中文翻译</w:t>
       </w:r>
     </w:p>
     <w:p>
       <w:pPr>
-        <w:spacing w:after="60"/>
-        <w:ind w:left="360" w:hanging="216"/>
+        <w:pStyle w:val="ListBullet"/>
+        <w:spacing w:after="30"/>
       </w:pPr>
       <w:r>
-        <w:rPr>
-          <w:rFonts w:ascii="Microsoft YaHei" w:hAnsi="Microsoft YaHei" w:eastAsia="Microsoft YaHei"/>
-          <w:b/>
-          <w:color w:val="1F4E79"/>
-          <w:sz w:val="21"/>
-        </w:rPr>
-        <w:t xml:space="preserve">• </w:t>
-      </w:r>
-      <w:r>
-        <w:rPr>
-          <w:rFonts w:ascii="Microsoft YaHei" w:hAnsi="Microsoft YaHei" w:eastAsia="Microsoft YaHei"/>
-          <w:sz w:val="21"/>
-        </w:rPr>
-        <w:t>核心功能：真实存在的功能，不确定的要明确写“不确定”。</w:t>
+        <w:t>给运营复核的竞品依据、关键词池、待核实清单、合规风险提醒</w:t>
       </w:r>
     </w:p>
     <w:p>
       <w:pPr>
-        <w:spacing w:after="60"/>
-        <w:ind w:left="360" w:hanging="216"/>
+        <w:spacing w:after="80" w:line="259" w:lineRule="auto"/>
       </w:pPr>
       <w:r>
-        <w:rPr>
-          <w:rFonts w:ascii="Microsoft YaHei" w:hAnsi="Microsoft YaHei" w:eastAsia="Microsoft YaHei"/>
-          <w:b/>
-          <w:color w:val="1F4E79"/>
-          <w:sz w:val="21"/>
-        </w:rPr>
-        <w:t xml:space="preserve">• </w:t>
-      </w:r>
-      <w:r>
-        <w:rPr>
-          <w:rFonts w:ascii="Microsoft YaHei" w:hAnsi="Microsoft YaHei" w:eastAsia="Microsoft YaHei"/>
-          <w:sz w:val="21"/>
-        </w:rPr>
-        <w:t>适用人群与场景：学生、教师、办公室、家庭、户外等。</w:t>
+        <w:t>注意：它不使用卖家精灵、SIF、ABA 等付费数据接口，只用 Amazon 前台公开信息。</w:t>
       </w:r>
     </w:p>
     <w:p>
       <w:pPr>
-        <w:spacing w:after="60"/>
-        <w:ind w:left="360" w:hanging="216"/>
+        <w:spacing w:after="80" w:line="259" w:lineRule="auto"/>
       </w:pPr>
       <w:r>
-        <w:rPr>
-          <w:rFonts w:ascii="Microsoft YaHei" w:hAnsi="Microsoft YaHei" w:eastAsia="Microsoft YaHei"/>
-          <w:b/>
-          <w:color w:val="1F4E79"/>
-          <w:sz w:val="21"/>
-        </w:rPr>
-        <w:t xml:space="preserve">• </w:t>
-      </w:r>
-      <w:r>
-        <w:rPr>
-          <w:rFonts w:ascii="Microsoft YaHei" w:hAnsi="Microsoft YaHei" w:eastAsia="Microsoft YaHei"/>
-          <w:sz w:val="21"/>
-        </w:rPr>
-        <w:t>不能乱写的信息：比如认证、安全、无毒、防水、适用年龄段。</w:t>
-      </w:r>
-    </w:p>
-    <w:tbl>
-      <w:tblPr>
-        <w:tblW w:type="auto" w:w="0"/>
-        <w:jc w:val="left"/>
-        <w:tblLook w:firstColumn="1" w:firstRow="1" w:lastColumn="0" w:lastRow="0" w:noHBand="0" w:noVBand="1" w:val="04A0"/>
-      </w:tblPr>
-      <w:tblGrid>
-        <w:gridCol w:w="9792"/>
-      </w:tblGrid>
-      <w:tr>
-        <w:tc>
-          <w:tcPr>
-            <w:tcW w:type="dxa" w:w="9792"/>
-            <w:shd w:fill="F7F7F7"/>
-            <w:tcBorders>
-              <w:top w:val="single" w:sz="4" w:space="0" w:color="D1D5DB"/>
-              <w:left w:val="single" w:sz="4" w:space="0" w:color="D1D5DB"/>
-              <w:bottom w:val="single" w:sz="4" w:space="0" w:color="D1D5DB"/>
-              <w:right w:val="single" w:sz="4" w:space="0" w:color="D1D5DB"/>
-            </w:tcBorders>
-            <w:tcMar>
-              <w:top w:w="140" w:type="dxa"/>
-              <w:start w:w="180" w:type="dxa"/>
-              <w:bottom w:w="140" w:type="dxa"/>
-              <w:end w:w="180" w:type="dxa"/>
-            </w:tcMar>
-          </w:tcPr>
-          <w:p>
-            <w:pPr>
-              <w:spacing w:after="0"/>
-            </w:pPr>
-            <w:r>
-              <w:rPr>
-                <w:rFonts w:ascii="Consolas" w:hAnsi="Consolas" w:eastAsia="Consolas"/>
-                <w:color w:val="111827"/>
-                <w:sz w:val="19"/>
-              </w:rPr>
-              <w:t>用 amazon-listing-auto-copywriter，产品是荧光笔，美国站。</w:t>
-            </w:r>
-          </w:p>
-          <w:p>
-            <w:pPr>
-              <w:spacing w:after="0"/>
-            </w:pPr>
-            <w:r>
-              <w:rPr>
-                <w:rFonts w:ascii="Consolas" w:hAnsi="Consolas" w:eastAsia="Consolas"/>
-                <w:color w:val="111827"/>
-                <w:sz w:val="19"/>
-              </w:rPr>
-              <w:t>已知信息：</w:t>
-            </w:r>
-          </w:p>
-          <w:p>
-            <w:pPr>
-              <w:spacing w:after="0"/>
-            </w:pPr>
-            <w:r>
-              <w:rPr>
-                <w:rFonts w:ascii="Consolas" w:hAnsi="Consolas" w:eastAsia="Consolas"/>
-                <w:color w:val="111827"/>
-                <w:sz w:val="19"/>
-              </w:rPr>
-              <w:t>- 8支装</w:t>
-            </w:r>
-          </w:p>
-          <w:p>
-            <w:pPr>
-              <w:spacing w:after="0"/>
-            </w:pPr>
-            <w:r>
-              <w:rPr>
-                <w:rFonts w:ascii="Consolas" w:hAnsi="Consolas" w:eastAsia="Consolas"/>
-                <w:color w:val="111827"/>
-                <w:sz w:val="19"/>
-              </w:rPr>
-              <w:t>- 多色</w:t>
-            </w:r>
-          </w:p>
-          <w:p>
-            <w:pPr>
-              <w:spacing w:after="0"/>
-            </w:pPr>
-            <w:r>
-              <w:rPr>
-                <w:rFonts w:ascii="Consolas" w:hAnsi="Consolas" w:eastAsia="Consolas"/>
-                <w:color w:val="111827"/>
-                <w:sz w:val="19"/>
-              </w:rPr>
-              <w:t>- 斜头</w:t>
-            </w:r>
-          </w:p>
-          <w:p>
-            <w:pPr>
-              <w:spacing w:after="0"/>
-            </w:pPr>
-            <w:r>
-              <w:rPr>
-                <w:rFonts w:ascii="Consolas" w:hAnsi="Consolas" w:eastAsia="Consolas"/>
-                <w:color w:val="111827"/>
-                <w:sz w:val="19"/>
-              </w:rPr>
-              <w:t>- 适合学生、教师、办公室、手账</w:t>
-            </w:r>
-          </w:p>
-          <w:p>
-            <w:pPr>
-              <w:spacing w:after="0"/>
-            </w:pPr>
-            <w:r>
-              <w:rPr>
-                <w:rFonts w:ascii="Consolas" w:hAnsi="Consolas" w:eastAsia="Consolas"/>
-                <w:color w:val="111827"/>
-                <w:sz w:val="19"/>
-              </w:rPr>
-              <w:t>不确定信息：</w:t>
-            </w:r>
-          </w:p>
-          <w:p>
-            <w:pPr>
-              <w:spacing w:after="0"/>
-            </w:pPr>
-            <w:r>
-              <w:rPr>
-                <w:rFonts w:ascii="Consolas" w:hAnsi="Consolas" w:eastAsia="Consolas"/>
-                <w:color w:val="111827"/>
-                <w:sz w:val="19"/>
-              </w:rPr>
-              <w:t>- 是否速干不确定</w:t>
-            </w:r>
-          </w:p>
-          <w:p>
-            <w:pPr>
-              <w:spacing w:after="0"/>
-            </w:pPr>
-            <w:r>
-              <w:rPr>
-                <w:rFonts w:ascii="Consolas" w:hAnsi="Consolas" w:eastAsia="Consolas"/>
-                <w:color w:val="111827"/>
-                <w:sz w:val="19"/>
-              </w:rPr>
-              <w:t>- 是否无毒不确定</w:t>
-            </w:r>
-          </w:p>
-          <w:p>
-            <w:pPr>
-              <w:spacing w:after="0"/>
-            </w:pPr>
-            <w:r>
-              <w:rPr>
-                <w:rFonts w:ascii="Consolas" w:hAnsi="Consolas" w:eastAsia="Consolas"/>
-                <w:color w:val="111827"/>
-                <w:sz w:val="19"/>
-              </w:rPr>
-              <w:t>- 是否可水洗不确定</w:t>
-            </w:r>
-          </w:p>
-        </w:tc>
-      </w:tr>
-    </w:tbl>
-    <w:p>
-      <w:pPr>
-        <w:pStyle w:val="Heading1"/>
-      </w:pPr>
-      <w:r>
-        <w:t>4. 最好用的提示词模板</w:t>
+        <w:t>它的竞品搜索逻辑是：Codex 先根据产品和站点生成当地买家会搜的关键词、相关性词、目标 BSR 类目；脚本只负责抓取 Amazon 页面、抽取公开字段、按 BSR 和近月购买热度等信号排序。脚本不会自己从一个中文品名里猜市场。</w:t>
       </w:r>
     </w:p>
     <w:p>
       <w:pPr>
-        <w:pStyle w:val="Heading2"/>
+        <w:pStyle w:val="Heading1"/>
+        <w:spacing w:before="200" w:after="80"/>
       </w:pPr>
       <w:r>
-        <w:t>模板 A：只有产品名</w:t>
-      </w:r>
-    </w:p>
-    <w:tbl>
-      <w:tblPr>
-        <w:tblW w:type="auto" w:w="0"/>
-        <w:jc w:val="left"/>
-        <w:tblLook w:firstColumn="1" w:firstRow="1" w:lastColumn="0" w:lastRow="0" w:noHBand="0" w:noVBand="1" w:val="04A0"/>
-      </w:tblPr>
-      <w:tblGrid>
-        <w:gridCol w:w="9792"/>
-      </w:tblGrid>
-      <w:tr>
-        <w:tc>
-          <w:tcPr>
-            <w:tcW w:type="dxa" w:w="9792"/>
-            <w:shd w:fill="F7F7F7"/>
-            <w:tcBorders>
-              <w:top w:val="single" w:sz="4" w:space="0" w:color="D1D5DB"/>
-              <w:left w:val="single" w:sz="4" w:space="0" w:color="D1D5DB"/>
-              <w:bottom w:val="single" w:sz="4" w:space="0" w:color="D1D5DB"/>
-              <w:right w:val="single" w:sz="4" w:space="0" w:color="D1D5DB"/>
-            </w:tcBorders>
-            <w:tcMar>
-              <w:top w:w="140" w:type="dxa"/>
-              <w:start w:w="180" w:type="dxa"/>
-              <w:bottom w:w="140" w:type="dxa"/>
-              <w:end w:w="180" w:type="dxa"/>
-            </w:tcMar>
-          </w:tcPr>
-          <w:p>
-            <w:pPr>
-              <w:spacing w:after="0"/>
-            </w:pPr>
-            <w:r>
-              <w:rPr>
-                <w:rFonts w:ascii="Consolas" w:hAnsi="Consolas" w:eastAsia="Consolas"/>
-                <w:color w:val="111827"/>
-                <w:sz w:val="19"/>
-              </w:rPr>
-              <w:t>用 amazon-listing-auto-copywriter，产品是【产品名】，美国站</w:t>
-            </w:r>
-          </w:p>
-        </w:tc>
-      </w:tr>
-    </w:tbl>
-    <w:p>
-      <w:pPr>
-        <w:pStyle w:val="Heading2"/>
-      </w:pPr>
-      <w:r>
-        <w:t>模板 B：有基础参数</w:t>
-      </w:r>
-    </w:p>
-    <w:tbl>
-      <w:tblPr>
-        <w:tblW w:type="auto" w:w="0"/>
-        <w:jc w:val="left"/>
-        <w:tblLook w:firstColumn="1" w:firstRow="1" w:lastColumn="0" w:lastRow="0" w:noHBand="0" w:noVBand="1" w:val="04A0"/>
-      </w:tblPr>
-      <w:tblGrid>
-        <w:gridCol w:w="9792"/>
-      </w:tblGrid>
-      <w:tr>
-        <w:tc>
-          <w:tcPr>
-            <w:tcW w:type="dxa" w:w="9792"/>
-            <w:shd w:fill="F7F7F7"/>
-            <w:tcBorders>
-              <w:top w:val="single" w:sz="4" w:space="0" w:color="D1D5DB"/>
-              <w:left w:val="single" w:sz="4" w:space="0" w:color="D1D5DB"/>
-              <w:bottom w:val="single" w:sz="4" w:space="0" w:color="D1D5DB"/>
-              <w:right w:val="single" w:sz="4" w:space="0" w:color="D1D5DB"/>
-            </w:tcBorders>
-            <w:tcMar>
-              <w:top w:w="140" w:type="dxa"/>
-              <w:start w:w="180" w:type="dxa"/>
-              <w:bottom w:w="140" w:type="dxa"/>
-              <w:end w:w="180" w:type="dxa"/>
-            </w:tcMar>
-          </w:tcPr>
-          <w:p>
-            <w:pPr>
-              <w:spacing w:after="0"/>
-            </w:pPr>
-            <w:r>
-              <w:rPr>
-                <w:rFonts w:ascii="Consolas" w:hAnsi="Consolas" w:eastAsia="Consolas"/>
-                <w:color w:val="111827"/>
-                <w:sz w:val="19"/>
-              </w:rPr>
-              <w:t>用 amazon-listing-auto-copywriter，产品是【产品名】，美国站。</w:t>
-            </w:r>
-          </w:p>
-          <w:p>
-            <w:pPr>
-              <w:spacing w:after="0"/>
-            </w:pPr>
-            <w:r>
-              <w:rPr>
-                <w:rFonts w:ascii="Consolas" w:hAnsi="Consolas" w:eastAsia="Consolas"/>
-                <w:color w:val="111827"/>
-                <w:sz w:val="19"/>
-              </w:rPr>
-              <w:t>已知信息：</w:t>
-            </w:r>
-          </w:p>
-          <w:p>
-            <w:pPr>
-              <w:spacing w:after="0"/>
-            </w:pPr>
-            <w:r>
-              <w:rPr>
-                <w:rFonts w:ascii="Consolas" w:hAnsi="Consolas" w:eastAsia="Consolas"/>
-                <w:color w:val="111827"/>
-                <w:sz w:val="19"/>
-              </w:rPr>
-              <w:t>- 【数量/尺寸/颜色】</w:t>
-            </w:r>
-          </w:p>
-          <w:p>
-            <w:pPr>
-              <w:spacing w:after="0"/>
-            </w:pPr>
-            <w:r>
-              <w:rPr>
-                <w:rFonts w:ascii="Consolas" w:hAnsi="Consolas" w:eastAsia="Consolas"/>
-                <w:color w:val="111827"/>
-                <w:sz w:val="19"/>
-              </w:rPr>
-              <w:t>- 【核心功能】</w:t>
-            </w:r>
-          </w:p>
-          <w:p>
-            <w:pPr>
-              <w:spacing w:after="0"/>
-            </w:pPr>
-            <w:r>
-              <w:rPr>
-                <w:rFonts w:ascii="Consolas" w:hAnsi="Consolas" w:eastAsia="Consolas"/>
-                <w:color w:val="111827"/>
-                <w:sz w:val="19"/>
-              </w:rPr>
-              <w:t>- 【适用场景】</w:t>
-            </w:r>
-          </w:p>
-          <w:p>
-            <w:pPr>
-              <w:spacing w:after="0"/>
-            </w:pPr>
-            <w:r>
-              <w:rPr>
-                <w:rFonts w:ascii="Consolas" w:hAnsi="Consolas" w:eastAsia="Consolas"/>
-                <w:color w:val="111827"/>
-                <w:sz w:val="19"/>
-              </w:rPr>
-              <w:t>不确定信息：</w:t>
-            </w:r>
-          </w:p>
-          <w:p>
-            <w:pPr>
-              <w:spacing w:after="0"/>
-            </w:pPr>
-            <w:r>
-              <w:rPr>
-                <w:rFonts w:ascii="Consolas" w:hAnsi="Consolas" w:eastAsia="Consolas"/>
-                <w:color w:val="111827"/>
-                <w:sz w:val="19"/>
-              </w:rPr>
-              <w:t>- 【不确定1】</w:t>
-            </w:r>
-          </w:p>
-          <w:p>
-            <w:pPr>
-              <w:spacing w:after="0"/>
-            </w:pPr>
-            <w:r>
-              <w:rPr>
-                <w:rFonts w:ascii="Consolas" w:hAnsi="Consolas" w:eastAsia="Consolas"/>
-                <w:color w:val="111827"/>
-                <w:sz w:val="19"/>
-              </w:rPr>
-              <w:t>- 【不确定2】</w:t>
-            </w:r>
-          </w:p>
-        </w:tc>
-      </w:tr>
-    </w:tbl>
-    <w:p>
-      <w:pPr>
-        <w:pStyle w:val="Heading2"/>
-      </w:pPr>
-      <w:r>
-        <w:t>模板 C：要求美国本土 Listing 语感</w:t>
-      </w:r>
-    </w:p>
-    <w:tbl>
-      <w:tblPr>
-        <w:tblW w:type="auto" w:w="0"/>
-        <w:jc w:val="left"/>
-        <w:tblLook w:firstColumn="1" w:firstRow="1" w:lastColumn="0" w:lastRow="0" w:noHBand="0" w:noVBand="1" w:val="04A0"/>
-      </w:tblPr>
-      <w:tblGrid>
-        <w:gridCol w:w="9792"/>
-      </w:tblGrid>
-      <w:tr>
-        <w:tc>
-          <w:tcPr>
-            <w:tcW w:type="dxa" w:w="9792"/>
-            <w:shd w:fill="F7F7F7"/>
-            <w:tcBorders>
-              <w:top w:val="single" w:sz="4" w:space="0" w:color="D1D5DB"/>
-              <w:left w:val="single" w:sz="4" w:space="0" w:color="D1D5DB"/>
-              <w:bottom w:val="single" w:sz="4" w:space="0" w:color="D1D5DB"/>
-              <w:right w:val="single" w:sz="4" w:space="0" w:color="D1D5DB"/>
-            </w:tcBorders>
-            <w:tcMar>
-              <w:top w:w="140" w:type="dxa"/>
-              <w:start w:w="180" w:type="dxa"/>
-              <w:bottom w:w="140" w:type="dxa"/>
-              <w:end w:w="180" w:type="dxa"/>
-            </w:tcMar>
-          </w:tcPr>
-          <w:p>
-            <w:pPr>
-              <w:spacing w:after="0"/>
-            </w:pPr>
-            <w:r>
-              <w:rPr>
-                <w:rFonts w:ascii="Consolas" w:hAnsi="Consolas" w:eastAsia="Consolas"/>
-                <w:color w:val="111827"/>
-                <w:sz w:val="19"/>
-              </w:rPr>
-              <w:t>用 amazon-listing-auto-copywriter，产品是【产品名】，美国站。</w:t>
-            </w:r>
-          </w:p>
-          <w:p>
-            <w:pPr>
-              <w:spacing w:after="0"/>
-            </w:pPr>
-            <w:r>
-              <w:rPr>
-                <w:rFonts w:ascii="Consolas" w:hAnsi="Consolas" w:eastAsia="Consolas"/>
-                <w:color w:val="111827"/>
-                <w:sz w:val="19"/>
-              </w:rPr>
-              <w:t>请按美国本土 Amazon Listing 语感写，五点要有场景、痛点、功能支撑和结果感。</w:t>
-            </w:r>
-          </w:p>
-          <w:p>
-            <w:pPr>
-              <w:spacing w:after="0"/>
-            </w:pPr>
-            <w:r>
-              <w:rPr>
-                <w:rFonts w:ascii="Consolas" w:hAnsi="Consolas" w:eastAsia="Consolas"/>
-                <w:color w:val="111827"/>
-                <w:sz w:val="19"/>
-              </w:rPr>
-              <w:t>中文对照要逐句完整翻译。</w:t>
-            </w:r>
-          </w:p>
-        </w:tc>
-      </w:tr>
-    </w:tbl>
-    <w:p>
-      <w:pPr>
-        <w:pStyle w:val="Heading2"/>
-      </w:pPr>
-      <w:r>
-        <w:t>模板 D：限制高风险词</w:t>
-      </w:r>
-    </w:p>
-    <w:tbl>
-      <w:tblPr>
-        <w:tblW w:type="auto" w:w="0"/>
-        <w:jc w:val="left"/>
-        <w:tblLook w:firstColumn="1" w:firstRow="1" w:lastColumn="0" w:lastRow="0" w:noHBand="0" w:noVBand="1" w:val="04A0"/>
-      </w:tblPr>
-      <w:tblGrid>
-        <w:gridCol w:w="9792"/>
-      </w:tblGrid>
-      <w:tr>
-        <w:tc>
-          <w:tcPr>
-            <w:tcW w:type="dxa" w:w="9792"/>
-            <w:shd w:fill="F7F7F7"/>
-            <w:tcBorders>
-              <w:top w:val="single" w:sz="4" w:space="0" w:color="D1D5DB"/>
-              <w:left w:val="single" w:sz="4" w:space="0" w:color="D1D5DB"/>
-              <w:bottom w:val="single" w:sz="4" w:space="0" w:color="D1D5DB"/>
-              <w:right w:val="single" w:sz="4" w:space="0" w:color="D1D5DB"/>
-            </w:tcBorders>
-            <w:tcMar>
-              <w:top w:w="140" w:type="dxa"/>
-              <w:start w:w="180" w:type="dxa"/>
-              <w:bottom w:w="140" w:type="dxa"/>
-              <w:end w:w="180" w:type="dxa"/>
-            </w:tcMar>
-          </w:tcPr>
-          <w:p>
-            <w:pPr>
-              <w:spacing w:after="0"/>
-            </w:pPr>
-            <w:r>
-              <w:rPr>
-                <w:rFonts w:ascii="Consolas" w:hAnsi="Consolas" w:eastAsia="Consolas"/>
-                <w:color w:val="111827"/>
-                <w:sz w:val="19"/>
-              </w:rPr>
-              <w:t>用 amazon-listing-auto-copywriter，产品是【产品名】，美国站。</w:t>
-            </w:r>
-          </w:p>
-          <w:p>
-            <w:pPr>
-              <w:spacing w:after="0"/>
-            </w:pPr>
-            <w:r>
-              <w:rPr>
-                <w:rFonts w:ascii="Consolas" w:hAnsi="Consolas" w:eastAsia="Consolas"/>
-                <w:color w:val="111827"/>
-                <w:sz w:val="19"/>
-              </w:rPr>
-              <w:t>以下内容没有资料支持，不要写进英文主文案：</w:t>
-            </w:r>
-          </w:p>
-          <w:p>
-            <w:pPr>
-              <w:spacing w:after="0"/>
-            </w:pPr>
-            <w:r>
-              <w:rPr>
-                <w:rFonts w:ascii="Consolas" w:hAnsi="Consolas" w:eastAsia="Consolas"/>
-                <w:color w:val="111827"/>
-                <w:sz w:val="19"/>
-              </w:rPr>
-              <w:t>- non-toxic</w:t>
-            </w:r>
-          </w:p>
-          <w:p>
-            <w:pPr>
-              <w:spacing w:after="0"/>
-            </w:pPr>
-            <w:r>
-              <w:rPr>
-                <w:rFonts w:ascii="Consolas" w:hAnsi="Consolas" w:eastAsia="Consolas"/>
-                <w:color w:val="111827"/>
-                <w:sz w:val="19"/>
-              </w:rPr>
-              <w:t>- waterproof</w:t>
-            </w:r>
-          </w:p>
-          <w:p>
-            <w:pPr>
-              <w:spacing w:after="0"/>
-            </w:pPr>
-            <w:r>
-              <w:rPr>
-                <w:rFonts w:ascii="Consolas" w:hAnsi="Consolas" w:eastAsia="Consolas"/>
-                <w:color w:val="111827"/>
-                <w:sz w:val="19"/>
-              </w:rPr>
-              <w:t>- certified</w:t>
-            </w:r>
-          </w:p>
-          <w:p>
-            <w:pPr>
-              <w:spacing w:after="0"/>
-            </w:pPr>
-            <w:r>
-              <w:rPr>
-                <w:rFonts w:ascii="Consolas" w:hAnsi="Consolas" w:eastAsia="Consolas"/>
-                <w:color w:val="111827"/>
-                <w:sz w:val="19"/>
-              </w:rPr>
-              <w:t>- safe for kids</w:t>
-            </w:r>
-          </w:p>
-          <w:p>
-            <w:pPr>
-              <w:spacing w:after="0"/>
-            </w:pPr>
-            <w:r>
-              <w:rPr>
-                <w:rFonts w:ascii="Consolas" w:hAnsi="Consolas" w:eastAsia="Consolas"/>
-                <w:color w:val="111827"/>
-                <w:sz w:val="19"/>
-              </w:rPr>
-              <w:t>- BPA-free</w:t>
-            </w:r>
-          </w:p>
-        </w:tc>
-      </w:tr>
-    </w:tbl>
-    <w:p>
-      <w:pPr>
-        <w:pStyle w:val="Heading1"/>
-      </w:pPr>
-      <w:r>
-        <w:t>5. 输出结果怎么看</w:t>
+        <w:t>第一次安装</w:t>
       </w:r>
     </w:p>
     <w:p>
       <w:pPr>
-        <w:spacing w:after="100"/>
-        <w:ind w:left="403" w:hanging="403"/>
+        <w:spacing w:after="80" w:line="259" w:lineRule="auto"/>
       </w:pPr>
       <w:r>
-        <w:rPr>
-          <w:rFonts w:ascii="Microsoft YaHei" w:hAnsi="Microsoft YaHei" w:eastAsia="Microsoft YaHei"/>
-          <w:b/>
-          <w:color w:val="1F4E79"/>
-          <w:sz w:val="21"/>
-        </w:rPr>
-        <w:t xml:space="preserve">1. </w:t>
-      </w:r>
-      <w:r>
-        <w:rPr>
-          <w:rFonts w:ascii="Microsoft YaHei" w:hAnsi="Microsoft YaHei" w:eastAsia="Microsoft YaHei"/>
-          <w:sz w:val="21"/>
-        </w:rPr>
-        <w:t>Amazon Copy - Enhanced Candidate Version：英文主文案区，可复制给运营修改，包含标题、五点、描述和后台搜索词。</w:t>
+        <w:t>在 Codex 里输入：</w:t>
       </w:r>
     </w:p>
     <w:p>
       <w:pPr>
-        <w:spacing w:after="100"/>
-        <w:ind w:left="403" w:hanging="403"/>
+        <w:pStyle w:val="CodeBlock"/>
+        <w:keepLines/>
       </w:pPr>
       <w:r>
-        <w:rPr>
-          <w:rFonts w:ascii="Microsoft YaHei" w:hAnsi="Microsoft YaHei" w:eastAsia="Microsoft YaHei"/>
-          <w:b/>
-          <w:color w:val="1F4E79"/>
-          <w:sz w:val="21"/>
-        </w:rPr>
-        <w:t xml:space="preserve">2. </w:t>
-      </w:r>
-      <w:r>
-        <w:rPr>
-          <w:rFonts w:ascii="Microsoft YaHei" w:hAnsi="Microsoft YaHei" w:eastAsia="Microsoft YaHei"/>
-          <w:sz w:val="21"/>
-        </w:rPr>
-        <w:t>中文文案对照：英文内容的一对一中文翻译，方便运营理解，不用于直接上架。</w:t>
+        <w:t>帮我安装这个 skill：https://github.com/hejun6666/maimeng/tree/main/skills/amazon-listing-auto-copywriter</w:t>
       </w:r>
     </w:p>
     <w:p>
       <w:pPr>
-        <w:spacing w:after="100"/>
-        <w:ind w:left="403" w:hanging="403"/>
+        <w:spacing w:after="80" w:line="259" w:lineRule="auto"/>
       </w:pPr>
       <w:r>
-        <w:rPr>
-          <w:rFonts w:ascii="Microsoft YaHei" w:hAnsi="Microsoft YaHei" w:eastAsia="Microsoft YaHei"/>
-          <w:b/>
-          <w:color w:val="1F4E79"/>
-          <w:sz w:val="21"/>
-        </w:rPr>
-        <w:t xml:space="preserve">3. </w:t>
-      </w:r>
-      <w:r>
-        <w:rPr>
-          <w:rFonts w:ascii="Microsoft YaHei" w:hAnsi="Microsoft YaHei" w:eastAsia="Microsoft YaHei"/>
-          <w:sz w:val="21"/>
-        </w:rPr>
-        <w:t>中文运营复核区：必须看，里面有竞品依据、关键词池、待核实清单和合规风险。</w:t>
-      </w:r>
-    </w:p>
-    <w:tbl>
-      <w:tblPr>
-        <w:tblW w:type="auto" w:w="0"/>
-        <w:jc w:val="left"/>
-        <w:tblLook w:firstColumn="1" w:firstRow="1" w:lastColumn="0" w:lastRow="0" w:noHBand="0" w:noVBand="1" w:val="04A0"/>
-      </w:tblPr>
-      <w:tblGrid>
-        <w:gridCol w:w="9792"/>
-      </w:tblGrid>
-      <w:tr>
-        <w:tc>
-          <w:tcPr>
-            <w:tcW w:type="dxa" w:w="9792"/>
-            <w:shd w:fill="EAF3F8"/>
-            <w:tcBorders>
-              <w:top w:val="single" w:sz="4" w:space="0" w:color="C9D6E2"/>
-              <w:left w:val="single" w:sz="4" w:space="0" w:color="C9D6E2"/>
-              <w:bottom w:val="single" w:sz="4" w:space="0" w:color="C9D6E2"/>
-              <w:right w:val="single" w:sz="4" w:space="0" w:color="C9D6E2"/>
-            </w:tcBorders>
-            <w:tcMar>
-              <w:top w:w="140" w:type="dxa"/>
-              <w:start w:w="180" w:type="dxa"/>
-              <w:bottom w:w="140" w:type="dxa"/>
-              <w:end w:w="180" w:type="dxa"/>
-            </w:tcMar>
-          </w:tcPr>
-          <w:p>
-            <w:pPr>
-              <w:spacing w:after="60"/>
-            </w:pPr>
-            <w:r>
-              <w:rPr>
-                <w:rFonts w:ascii="Microsoft YaHei" w:hAnsi="Microsoft YaHei" w:eastAsia="Microsoft YaHei"/>
-                <w:b/>
-                <w:color w:val="1F4E79"/>
-                <w:sz w:val="21"/>
-              </w:rPr>
-              <w:t>成功触发的标志</w:t>
-            </w:r>
-          </w:p>
-          <w:p>
-            <w:pPr>
-              <w:spacing w:after="0"/>
-            </w:pPr>
-            <w:r>
-              <w:rPr>
-                <w:rFonts w:ascii="Microsoft YaHei" w:hAnsi="Microsoft YaHei" w:eastAsia="Microsoft YaHei"/>
-                <w:sz w:val="20"/>
-              </w:rPr>
-              <w:t>输出里应该出现 Amazon Copy - Enhanced Candidate Version、中文文案对照、中文运营复核区，并且有 ASIN、Bought Past Month、Best Sellers Rank、Rating、Reviews、Images 等竞品抓取依据。</w:t>
-            </w:r>
-          </w:p>
-        </w:tc>
-      </w:tr>
-    </w:tbl>
-    <w:p>
-      <w:pPr>
-        <w:pStyle w:val="Heading1"/>
-      </w:pPr>
-      <w:r>
-        <w:t>6. 运营复核清单</w:t>
-      </w:r>
-    </w:p>
-    <w:tbl>
-      <w:tblPr>
-        <w:tblW w:type="auto" w:w="0"/>
-        <w:jc w:val="left"/>
-        <w:tblLook w:firstColumn="1" w:firstRow="1" w:lastColumn="0" w:lastRow="0" w:noHBand="0" w:noVBand="1" w:val="04A0"/>
-      </w:tblPr>
-      <w:tblGrid>
-        <w:gridCol w:w="3264"/>
-        <w:gridCol w:w="3264"/>
-        <w:gridCol w:w="3264"/>
-      </w:tblGrid>
-      <w:tr>
-        <w:tc>
-          <w:tcPr>
-            <w:tcW w:type="dxa" w:w="3264"/>
-            <w:shd w:fill="EAF3F8"/>
-            <w:tcBorders>
-              <w:top w:val="single" w:sz="4" w:space="0" w:color="D9E2EA"/>
-              <w:left w:val="single" w:sz="4" w:space="0" w:color="D9E2EA"/>
-              <w:bottom w:val="single" w:sz="4" w:space="0" w:color="D9E2EA"/>
-              <w:right w:val="single" w:sz="4" w:space="0" w:color="D9E2EA"/>
-            </w:tcBorders>
-            <w:tcMar>
-              <w:top w:w="100" w:type="dxa"/>
-              <w:start w:w="120" w:type="dxa"/>
-              <w:bottom w:w="100" w:type="dxa"/>
-              <w:end w:w="120" w:type="dxa"/>
-            </w:tcMar>
-          </w:tcPr>
-          <w:p>
-            <w:r>
-              <w:rPr>
-                <w:rFonts w:ascii="Microsoft YaHei" w:hAnsi="Microsoft YaHei" w:eastAsia="Microsoft YaHei"/>
-                <w:b/>
-                <w:color w:val="1F4E79"/>
-                <w:sz w:val="20"/>
-              </w:rPr>
-              <w:t>复核项</w:t>
-            </w:r>
-          </w:p>
-        </w:tc>
-        <w:tc>
-          <w:tcPr>
-            <w:tcW w:type="dxa" w:w="3264"/>
-            <w:shd w:fill="EAF3F8"/>
-            <w:tcBorders>
-              <w:top w:val="single" w:sz="4" w:space="0" w:color="D9E2EA"/>
-              <w:left w:val="single" w:sz="4" w:space="0" w:color="D9E2EA"/>
-              <w:bottom w:val="single" w:sz="4" w:space="0" w:color="D9E2EA"/>
-              <w:right w:val="single" w:sz="4" w:space="0" w:color="D9E2EA"/>
-            </w:tcBorders>
-            <w:tcMar>
-              <w:top w:w="100" w:type="dxa"/>
-              <w:start w:w="120" w:type="dxa"/>
-              <w:bottom w:w="100" w:type="dxa"/>
-              <w:end w:w="120" w:type="dxa"/>
-            </w:tcMar>
-          </w:tcPr>
-          <w:p>
-            <w:r>
-              <w:rPr>
-                <w:rFonts w:ascii="Microsoft YaHei" w:hAnsi="Microsoft YaHei" w:eastAsia="Microsoft YaHei"/>
-                <w:b/>
-                <w:color w:val="1F4E79"/>
-                <w:sz w:val="20"/>
-              </w:rPr>
-              <w:t>为什么要看</w:t>
-            </w:r>
-          </w:p>
-        </w:tc>
-        <w:tc>
-          <w:tcPr>
-            <w:tcW w:type="dxa" w:w="3264"/>
-            <w:shd w:fill="EAF3F8"/>
-            <w:tcBorders>
-              <w:top w:val="single" w:sz="4" w:space="0" w:color="D9E2EA"/>
-              <w:left w:val="single" w:sz="4" w:space="0" w:color="D9E2EA"/>
-              <w:bottom w:val="single" w:sz="4" w:space="0" w:color="D9E2EA"/>
-              <w:right w:val="single" w:sz="4" w:space="0" w:color="D9E2EA"/>
-            </w:tcBorders>
-            <w:tcMar>
-              <w:top w:w="100" w:type="dxa"/>
-              <w:start w:w="120" w:type="dxa"/>
-              <w:bottom w:w="100" w:type="dxa"/>
-              <w:end w:w="120" w:type="dxa"/>
-            </w:tcMar>
-          </w:tcPr>
-          <w:p>
-            <w:r>
-              <w:rPr>
-                <w:rFonts w:ascii="Microsoft YaHei" w:hAnsi="Microsoft YaHei" w:eastAsia="Microsoft YaHei"/>
-                <w:b/>
-                <w:color w:val="1F4E79"/>
-                <w:sz w:val="20"/>
-              </w:rPr>
-              <w:t>处理建议</w:t>
-            </w:r>
-          </w:p>
-        </w:tc>
-      </w:tr>
-      <w:tr>
-        <w:tc>
-          <w:tcPr>
-            <w:tcW w:type="dxa" w:w="2304"/>
-            <w:tcBorders>
-              <w:top w:val="single" w:sz="4" w:space="0" w:color="D9E2EA"/>
-              <w:left w:val="single" w:sz="4" w:space="0" w:color="D9E2EA"/>
-              <w:bottom w:val="single" w:sz="4" w:space="0" w:color="D9E2EA"/>
-              <w:right w:val="single" w:sz="4" w:space="0" w:color="D9E2EA"/>
-            </w:tcBorders>
-            <w:tcMar>
-              <w:top w:w="100" w:type="dxa"/>
-              <w:start w:w="120" w:type="dxa"/>
-              <w:bottom w:w="100" w:type="dxa"/>
-              <w:end w:w="120" w:type="dxa"/>
-            </w:tcMar>
-            <w:vAlign w:val="center"/>
-          </w:tcPr>
-          <w:p>
-            <w:pPr>
-              <w:spacing w:after="0"/>
-            </w:pPr>
-            <w:r>
-              <w:rPr>
-                <w:rFonts w:ascii="Microsoft YaHei" w:hAnsi="Microsoft YaHei" w:eastAsia="Microsoft YaHei"/>
-                <w:sz w:val="19"/>
-              </w:rPr>
-              <w:t>尺寸/数量/颜色</w:t>
-            </w:r>
-          </w:p>
-        </w:tc>
-        <w:tc>
-          <w:tcPr>
-            <w:tcW w:type="dxa" w:w="3528"/>
-            <w:tcBorders>
-              <w:top w:val="single" w:sz="4" w:space="0" w:color="D9E2EA"/>
-              <w:left w:val="single" w:sz="4" w:space="0" w:color="D9E2EA"/>
-              <w:bottom w:val="single" w:sz="4" w:space="0" w:color="D9E2EA"/>
-              <w:right w:val="single" w:sz="4" w:space="0" w:color="D9E2EA"/>
-            </w:tcBorders>
-            <w:tcMar>
-              <w:top w:w="100" w:type="dxa"/>
-              <w:start w:w="120" w:type="dxa"/>
-              <w:bottom w:w="100" w:type="dxa"/>
-              <w:end w:w="120" w:type="dxa"/>
-            </w:tcMar>
-            <w:vAlign w:val="center"/>
-          </w:tcPr>
-          <w:p>
-            <w:pPr>
-              <w:spacing w:after="0"/>
-            </w:pPr>
-            <w:r>
-              <w:rPr>
-                <w:rFonts w:ascii="Microsoft YaHei" w:hAnsi="Microsoft YaHei" w:eastAsia="Microsoft YaHei"/>
-                <w:sz w:val="19"/>
-              </w:rPr>
-              <w:t>这些是客观参数，错了会直接造成客诉</w:t>
-            </w:r>
-          </w:p>
-        </w:tc>
-        <w:tc>
-          <w:tcPr>
-            <w:tcW w:type="dxa" w:w="3528"/>
-            <w:tcBorders>
-              <w:top w:val="single" w:sz="4" w:space="0" w:color="D9E2EA"/>
-              <w:left w:val="single" w:sz="4" w:space="0" w:color="D9E2EA"/>
-              <w:bottom w:val="single" w:sz="4" w:space="0" w:color="D9E2EA"/>
-              <w:right w:val="single" w:sz="4" w:space="0" w:color="D9E2EA"/>
-            </w:tcBorders>
-            <w:tcMar>
-              <w:top w:w="100" w:type="dxa"/>
-              <w:start w:w="120" w:type="dxa"/>
-              <w:bottom w:w="100" w:type="dxa"/>
-              <w:end w:w="120" w:type="dxa"/>
-            </w:tcMar>
-            <w:vAlign w:val="center"/>
-          </w:tcPr>
-          <w:p>
-            <w:pPr>
-              <w:spacing w:after="0"/>
-            </w:pPr>
-            <w:r>
-              <w:rPr>
-                <w:rFonts w:ascii="Microsoft YaHei" w:hAnsi="Microsoft YaHei" w:eastAsia="Microsoft YaHei"/>
-                <w:sz w:val="19"/>
-              </w:rPr>
-              <w:t>按实物、包装、供应商资料修改</w:t>
-            </w:r>
-          </w:p>
-        </w:tc>
-      </w:tr>
-      <w:tr>
-        <w:tc>
-          <w:tcPr>
-            <w:tcW w:type="dxa" w:w="2304"/>
-            <w:tcBorders>
-              <w:top w:val="single" w:sz="4" w:space="0" w:color="D9E2EA"/>
-              <w:left w:val="single" w:sz="4" w:space="0" w:color="D9E2EA"/>
-              <w:bottom w:val="single" w:sz="4" w:space="0" w:color="D9E2EA"/>
-              <w:right w:val="single" w:sz="4" w:space="0" w:color="D9E2EA"/>
-            </w:tcBorders>
-            <w:tcMar>
-              <w:top w:w="100" w:type="dxa"/>
-              <w:start w:w="120" w:type="dxa"/>
-              <w:bottom w:w="100" w:type="dxa"/>
-              <w:end w:w="120" w:type="dxa"/>
-            </w:tcMar>
-            <w:vAlign w:val="center"/>
-          </w:tcPr>
-          <w:p>
-            <w:pPr>
-              <w:spacing w:after="0"/>
-            </w:pPr>
-            <w:r>
-              <w:rPr>
-                <w:rFonts w:ascii="Microsoft YaHei" w:hAnsi="Microsoft YaHei" w:eastAsia="Microsoft YaHei"/>
-                <w:sz w:val="19"/>
-              </w:rPr>
-              <w:t>材质/配件</w:t>
-            </w:r>
-          </w:p>
-        </w:tc>
-        <w:tc>
-          <w:tcPr>
-            <w:tcW w:type="dxa" w:w="3528"/>
-            <w:tcBorders>
-              <w:top w:val="single" w:sz="4" w:space="0" w:color="D9E2EA"/>
-              <w:left w:val="single" w:sz="4" w:space="0" w:color="D9E2EA"/>
-              <w:bottom w:val="single" w:sz="4" w:space="0" w:color="D9E2EA"/>
-              <w:right w:val="single" w:sz="4" w:space="0" w:color="D9E2EA"/>
-            </w:tcBorders>
-            <w:tcMar>
-              <w:top w:w="100" w:type="dxa"/>
-              <w:start w:w="120" w:type="dxa"/>
-              <w:bottom w:w="100" w:type="dxa"/>
-              <w:end w:w="120" w:type="dxa"/>
-            </w:tcMar>
-            <w:vAlign w:val="center"/>
-          </w:tcPr>
-          <w:p>
-            <w:pPr>
-              <w:spacing w:after="0"/>
-            </w:pPr>
-            <w:r>
-              <w:rPr>
-                <w:rFonts w:ascii="Microsoft YaHei" w:hAnsi="Microsoft YaHei" w:eastAsia="Microsoft YaHei"/>
-                <w:sz w:val="19"/>
-              </w:rPr>
-              <w:t>竞品有不代表我们的产品有</w:t>
-            </w:r>
-          </w:p>
-        </w:tc>
-        <w:tc>
-          <w:tcPr>
-            <w:tcW w:type="dxa" w:w="3528"/>
-            <w:tcBorders>
-              <w:top w:val="single" w:sz="4" w:space="0" w:color="D9E2EA"/>
-              <w:left w:val="single" w:sz="4" w:space="0" w:color="D9E2EA"/>
-              <w:bottom w:val="single" w:sz="4" w:space="0" w:color="D9E2EA"/>
-              <w:right w:val="single" w:sz="4" w:space="0" w:color="D9E2EA"/>
-            </w:tcBorders>
-            <w:tcMar>
-              <w:top w:w="100" w:type="dxa"/>
-              <w:start w:w="120" w:type="dxa"/>
-              <w:bottom w:w="100" w:type="dxa"/>
-              <w:end w:w="120" w:type="dxa"/>
-            </w:tcMar>
-            <w:vAlign w:val="center"/>
-          </w:tcPr>
-          <w:p>
-            <w:pPr>
-              <w:spacing w:after="0"/>
-            </w:pPr>
-            <w:r>
-              <w:rPr>
-                <w:rFonts w:ascii="Microsoft YaHei" w:hAnsi="Microsoft YaHei" w:eastAsia="Microsoft YaHei"/>
-                <w:sz w:val="19"/>
-              </w:rPr>
-              <w:t>没有资料就删掉或改弱</w:t>
-            </w:r>
-          </w:p>
-        </w:tc>
-      </w:tr>
-      <w:tr>
-        <w:tc>
-          <w:tcPr>
-            <w:tcW w:type="dxa" w:w="2304"/>
-            <w:tcBorders>
-              <w:top w:val="single" w:sz="4" w:space="0" w:color="D9E2EA"/>
-              <w:left w:val="single" w:sz="4" w:space="0" w:color="D9E2EA"/>
-              <w:bottom w:val="single" w:sz="4" w:space="0" w:color="D9E2EA"/>
-              <w:right w:val="single" w:sz="4" w:space="0" w:color="D9E2EA"/>
-            </w:tcBorders>
-            <w:tcMar>
-              <w:top w:w="100" w:type="dxa"/>
-              <w:start w:w="120" w:type="dxa"/>
-              <w:bottom w:w="100" w:type="dxa"/>
-              <w:end w:w="120" w:type="dxa"/>
-            </w:tcMar>
-            <w:vAlign w:val="center"/>
-          </w:tcPr>
-          <w:p>
-            <w:pPr>
-              <w:spacing w:after="0"/>
-            </w:pPr>
-            <w:r>
-              <w:rPr>
-                <w:rFonts w:ascii="Microsoft YaHei" w:hAnsi="Microsoft YaHei" w:eastAsia="Microsoft YaHei"/>
-                <w:sz w:val="19"/>
-              </w:rPr>
-              <w:t>速干/低晕染/防水</w:t>
-            </w:r>
-          </w:p>
-        </w:tc>
-        <w:tc>
-          <w:tcPr>
-            <w:tcW w:type="dxa" w:w="3528"/>
-            <w:tcBorders>
-              <w:top w:val="single" w:sz="4" w:space="0" w:color="D9E2EA"/>
-              <w:left w:val="single" w:sz="4" w:space="0" w:color="D9E2EA"/>
-              <w:bottom w:val="single" w:sz="4" w:space="0" w:color="D9E2EA"/>
-              <w:right w:val="single" w:sz="4" w:space="0" w:color="D9E2EA"/>
-            </w:tcBorders>
-            <w:tcMar>
-              <w:top w:w="100" w:type="dxa"/>
-              <w:start w:w="120" w:type="dxa"/>
-              <w:bottom w:w="100" w:type="dxa"/>
-              <w:end w:w="120" w:type="dxa"/>
-            </w:tcMar>
-            <w:vAlign w:val="center"/>
-          </w:tcPr>
-          <w:p>
-            <w:pPr>
-              <w:spacing w:after="0"/>
-            </w:pPr>
-            <w:r>
-              <w:rPr>
-                <w:rFonts w:ascii="Microsoft YaHei" w:hAnsi="Microsoft YaHei" w:eastAsia="Microsoft YaHei"/>
-                <w:sz w:val="19"/>
-              </w:rPr>
-              <w:t>属于性能声明，需要测试或资料支持</w:t>
-            </w:r>
-          </w:p>
-        </w:tc>
-        <w:tc>
-          <w:tcPr>
-            <w:tcW w:type="dxa" w:w="3528"/>
-            <w:tcBorders>
-              <w:top w:val="single" w:sz="4" w:space="0" w:color="D9E2EA"/>
-              <w:left w:val="single" w:sz="4" w:space="0" w:color="D9E2EA"/>
-              <w:bottom w:val="single" w:sz="4" w:space="0" w:color="D9E2EA"/>
-              <w:right w:val="single" w:sz="4" w:space="0" w:color="D9E2EA"/>
-            </w:tcBorders>
-            <w:tcMar>
-              <w:top w:w="100" w:type="dxa"/>
-              <w:start w:w="120" w:type="dxa"/>
-              <w:bottom w:w="100" w:type="dxa"/>
-              <w:end w:w="120" w:type="dxa"/>
-            </w:tcMar>
-            <w:vAlign w:val="center"/>
-          </w:tcPr>
-          <w:p>
-            <w:pPr>
-              <w:spacing w:after="0"/>
-            </w:pPr>
-            <w:r>
-              <w:rPr>
-                <w:rFonts w:ascii="Microsoft YaHei" w:hAnsi="Microsoft YaHei" w:eastAsia="Microsoft YaHei"/>
-                <w:sz w:val="19"/>
-              </w:rPr>
-              <w:t>不能确认就不要写得太绝对</w:t>
-            </w:r>
-          </w:p>
-        </w:tc>
-      </w:tr>
-      <w:tr>
-        <w:tc>
-          <w:tcPr>
-            <w:tcW w:type="dxa" w:w="2304"/>
-            <w:tcBorders>
-              <w:top w:val="single" w:sz="4" w:space="0" w:color="D9E2EA"/>
-              <w:left w:val="single" w:sz="4" w:space="0" w:color="D9E2EA"/>
-              <w:bottom w:val="single" w:sz="4" w:space="0" w:color="D9E2EA"/>
-              <w:right w:val="single" w:sz="4" w:space="0" w:color="D9E2EA"/>
-            </w:tcBorders>
-            <w:tcMar>
-              <w:top w:w="100" w:type="dxa"/>
-              <w:start w:w="120" w:type="dxa"/>
-              <w:bottom w:w="100" w:type="dxa"/>
-              <w:end w:w="120" w:type="dxa"/>
-            </w:tcMar>
-            <w:vAlign w:val="center"/>
-          </w:tcPr>
-          <w:p>
-            <w:pPr>
-              <w:spacing w:after="0"/>
-            </w:pPr>
-            <w:r>
-              <w:rPr>
-                <w:rFonts w:ascii="Microsoft YaHei" w:hAnsi="Microsoft YaHei" w:eastAsia="Microsoft YaHei"/>
-                <w:sz w:val="19"/>
-              </w:rPr>
-              <w:t>无毒/儿童安全/认证</w:t>
-            </w:r>
-          </w:p>
-        </w:tc>
-        <w:tc>
-          <w:tcPr>
-            <w:tcW w:type="dxa" w:w="3528"/>
-            <w:tcBorders>
-              <w:top w:val="single" w:sz="4" w:space="0" w:color="D9E2EA"/>
-              <w:left w:val="single" w:sz="4" w:space="0" w:color="D9E2EA"/>
-              <w:bottom w:val="single" w:sz="4" w:space="0" w:color="D9E2EA"/>
-              <w:right w:val="single" w:sz="4" w:space="0" w:color="D9E2EA"/>
-            </w:tcBorders>
-            <w:tcMar>
-              <w:top w:w="100" w:type="dxa"/>
-              <w:start w:w="120" w:type="dxa"/>
-              <w:bottom w:w="100" w:type="dxa"/>
-              <w:end w:w="120" w:type="dxa"/>
-            </w:tcMar>
-            <w:vAlign w:val="center"/>
-          </w:tcPr>
-          <w:p>
-            <w:pPr>
-              <w:spacing w:after="0"/>
-            </w:pPr>
-            <w:r>
-              <w:rPr>
-                <w:rFonts w:ascii="Microsoft YaHei" w:hAnsi="Microsoft YaHei" w:eastAsia="Microsoft YaHei"/>
-                <w:sz w:val="19"/>
-              </w:rPr>
-              <w:t>属于合规高风险表达</w:t>
-            </w:r>
-          </w:p>
-        </w:tc>
-        <w:tc>
-          <w:tcPr>
-            <w:tcW w:type="dxa" w:w="3528"/>
-            <w:tcBorders>
-              <w:top w:val="single" w:sz="4" w:space="0" w:color="D9E2EA"/>
-              <w:left w:val="single" w:sz="4" w:space="0" w:color="D9E2EA"/>
-              <w:bottom w:val="single" w:sz="4" w:space="0" w:color="D9E2EA"/>
-              <w:right w:val="single" w:sz="4" w:space="0" w:color="D9E2EA"/>
-            </w:tcBorders>
-            <w:tcMar>
-              <w:top w:w="100" w:type="dxa"/>
-              <w:start w:w="120" w:type="dxa"/>
-              <w:bottom w:w="100" w:type="dxa"/>
-              <w:end w:w="120" w:type="dxa"/>
-            </w:tcMar>
-            <w:vAlign w:val="center"/>
-          </w:tcPr>
-          <w:p>
-            <w:pPr>
-              <w:spacing w:after="0"/>
-            </w:pPr>
-            <w:r>
-              <w:rPr>
-                <w:rFonts w:ascii="Microsoft YaHei" w:hAnsi="Microsoft YaHei" w:eastAsia="Microsoft YaHei"/>
-                <w:sz w:val="19"/>
-              </w:rPr>
-              <w:t>必须有证书或检测报告再写</w:t>
-            </w:r>
-          </w:p>
-        </w:tc>
-      </w:tr>
-      <w:tr>
-        <w:tc>
-          <w:tcPr>
-            <w:tcW w:type="dxa" w:w="2304"/>
-            <w:tcBorders>
-              <w:top w:val="single" w:sz="4" w:space="0" w:color="D9E2EA"/>
-              <w:left w:val="single" w:sz="4" w:space="0" w:color="D9E2EA"/>
-              <w:bottom w:val="single" w:sz="4" w:space="0" w:color="D9E2EA"/>
-              <w:right w:val="single" w:sz="4" w:space="0" w:color="D9E2EA"/>
-            </w:tcBorders>
-            <w:tcMar>
-              <w:top w:w="100" w:type="dxa"/>
-              <w:start w:w="120" w:type="dxa"/>
-              <w:bottom w:w="100" w:type="dxa"/>
-              <w:end w:w="120" w:type="dxa"/>
-            </w:tcMar>
-            <w:vAlign w:val="center"/>
-          </w:tcPr>
-          <w:p>
-            <w:pPr>
-              <w:spacing w:after="0"/>
-            </w:pPr>
-            <w:r>
-              <w:rPr>
-                <w:rFonts w:ascii="Microsoft YaHei" w:hAnsi="Microsoft YaHei" w:eastAsia="Microsoft YaHei"/>
-                <w:sz w:val="19"/>
-              </w:rPr>
-              <w:t>年龄段/适用人群</w:t>
-            </w:r>
-          </w:p>
-        </w:tc>
-        <w:tc>
-          <w:tcPr>
-            <w:tcW w:type="dxa" w:w="3528"/>
-            <w:tcBorders>
-              <w:top w:val="single" w:sz="4" w:space="0" w:color="D9E2EA"/>
-              <w:left w:val="single" w:sz="4" w:space="0" w:color="D9E2EA"/>
-              <w:bottom w:val="single" w:sz="4" w:space="0" w:color="D9E2EA"/>
-              <w:right w:val="single" w:sz="4" w:space="0" w:color="D9E2EA"/>
-            </w:tcBorders>
-            <w:tcMar>
-              <w:top w:w="100" w:type="dxa"/>
-              <w:start w:w="120" w:type="dxa"/>
-              <w:bottom w:w="100" w:type="dxa"/>
-              <w:end w:w="120" w:type="dxa"/>
-            </w:tcMar>
-            <w:vAlign w:val="center"/>
-          </w:tcPr>
-          <w:p>
-            <w:pPr>
-              <w:spacing w:after="0"/>
-            </w:pPr>
-            <w:r>
-              <w:rPr>
-                <w:rFonts w:ascii="Microsoft YaHei" w:hAnsi="Microsoft YaHei" w:eastAsia="Microsoft YaHei"/>
-                <w:sz w:val="19"/>
-              </w:rPr>
-              <w:t>儿童、婴儿类尤其敏感</w:t>
-            </w:r>
-          </w:p>
-        </w:tc>
-        <w:tc>
-          <w:tcPr>
-            <w:tcW w:type="dxa" w:w="3528"/>
-            <w:tcBorders>
-              <w:top w:val="single" w:sz="4" w:space="0" w:color="D9E2EA"/>
-              <w:left w:val="single" w:sz="4" w:space="0" w:color="D9E2EA"/>
-              <w:bottom w:val="single" w:sz="4" w:space="0" w:color="D9E2EA"/>
-              <w:right w:val="single" w:sz="4" w:space="0" w:color="D9E2EA"/>
-            </w:tcBorders>
-            <w:tcMar>
-              <w:top w:w="100" w:type="dxa"/>
-              <w:start w:w="120" w:type="dxa"/>
-              <w:bottom w:w="100" w:type="dxa"/>
-              <w:end w:w="120" w:type="dxa"/>
-            </w:tcMar>
-            <w:vAlign w:val="center"/>
-          </w:tcPr>
-          <w:p>
-            <w:pPr>
-              <w:spacing w:after="0"/>
-            </w:pPr>
-            <w:r>
-              <w:rPr>
-                <w:rFonts w:ascii="Microsoft YaHei" w:hAnsi="Microsoft YaHei" w:eastAsia="Microsoft YaHei"/>
-                <w:sz w:val="19"/>
-              </w:rPr>
-              <w:t>不能确认就写成更泛化人群</w:t>
-            </w:r>
-          </w:p>
-        </w:tc>
-      </w:tr>
-      <w:tr>
-        <w:tc>
-          <w:tcPr>
-            <w:tcW w:type="dxa" w:w="2304"/>
-            <w:tcBorders>
-              <w:top w:val="single" w:sz="4" w:space="0" w:color="D9E2EA"/>
-              <w:left w:val="single" w:sz="4" w:space="0" w:color="D9E2EA"/>
-              <w:bottom w:val="single" w:sz="4" w:space="0" w:color="D9E2EA"/>
-              <w:right w:val="single" w:sz="4" w:space="0" w:color="D9E2EA"/>
-            </w:tcBorders>
-            <w:tcMar>
-              <w:top w:w="100" w:type="dxa"/>
-              <w:start w:w="120" w:type="dxa"/>
-              <w:bottom w:w="100" w:type="dxa"/>
-              <w:end w:w="120" w:type="dxa"/>
-            </w:tcMar>
-            <w:vAlign w:val="center"/>
-          </w:tcPr>
-          <w:p>
-            <w:pPr>
-              <w:spacing w:after="0"/>
-            </w:pPr>
-            <w:r>
-              <w:rPr>
-                <w:rFonts w:ascii="Microsoft YaHei" w:hAnsi="Microsoft YaHei" w:eastAsia="Microsoft YaHei"/>
-                <w:sz w:val="19"/>
-              </w:rPr>
-              <w:t>后台词</w:t>
-            </w:r>
-          </w:p>
-        </w:tc>
-        <w:tc>
-          <w:tcPr>
-            <w:tcW w:type="dxa" w:w="3528"/>
-            <w:tcBorders>
-              <w:top w:val="single" w:sz="4" w:space="0" w:color="D9E2EA"/>
-              <w:left w:val="single" w:sz="4" w:space="0" w:color="D9E2EA"/>
-              <w:bottom w:val="single" w:sz="4" w:space="0" w:color="D9E2EA"/>
-              <w:right w:val="single" w:sz="4" w:space="0" w:color="D9E2EA"/>
-            </w:tcBorders>
-            <w:tcMar>
-              <w:top w:w="100" w:type="dxa"/>
-              <w:start w:w="120" w:type="dxa"/>
-              <w:bottom w:w="100" w:type="dxa"/>
-              <w:end w:w="120" w:type="dxa"/>
-            </w:tcMar>
-            <w:vAlign w:val="center"/>
-          </w:tcPr>
-          <w:p>
-            <w:pPr>
-              <w:spacing w:after="0"/>
-            </w:pPr>
-            <w:r>
-              <w:rPr>
-                <w:rFonts w:ascii="Microsoft YaHei" w:hAnsi="Microsoft YaHei" w:eastAsia="Microsoft YaHei"/>
-                <w:sz w:val="19"/>
-              </w:rPr>
-              <w:t>会影响搜索相关性和合规</w:t>
-            </w:r>
-          </w:p>
-        </w:tc>
-        <w:tc>
-          <w:tcPr>
-            <w:tcW w:type="dxa" w:w="3528"/>
-            <w:tcBorders>
-              <w:top w:val="single" w:sz="4" w:space="0" w:color="D9E2EA"/>
-              <w:left w:val="single" w:sz="4" w:space="0" w:color="D9E2EA"/>
-              <w:bottom w:val="single" w:sz="4" w:space="0" w:color="D9E2EA"/>
-              <w:right w:val="single" w:sz="4" w:space="0" w:color="D9E2EA"/>
-            </w:tcBorders>
-            <w:tcMar>
-              <w:top w:w="100" w:type="dxa"/>
-              <w:start w:w="120" w:type="dxa"/>
-              <w:bottom w:w="100" w:type="dxa"/>
-              <w:end w:w="120" w:type="dxa"/>
-            </w:tcMar>
-            <w:vAlign w:val="center"/>
-          </w:tcPr>
-          <w:p>
-            <w:pPr>
-              <w:spacing w:after="0"/>
-            </w:pPr>
-            <w:r>
-              <w:rPr>
-                <w:rFonts w:ascii="Microsoft YaHei" w:hAnsi="Microsoft YaHei" w:eastAsia="Microsoft YaHei"/>
-                <w:sz w:val="19"/>
-              </w:rPr>
-              <w:t>删掉不相关或没依据的词</w:t>
-            </w:r>
-          </w:p>
-        </w:tc>
-      </w:tr>
-    </w:tbl>
-    <w:p>
-      <w:pPr>
-        <w:pStyle w:val="Heading1"/>
-      </w:pPr>
-      <w:r>
-        <w:t>7. 常见问题</w:t>
+        <w:t>安装完成后，重启 Codex。</w:t>
       </w:r>
     </w:p>
     <w:p>
       <w:pPr>
-        <w:pStyle w:val="Heading2"/>
+        <w:pStyle w:val="Heading1"/>
+        <w:spacing w:before="200" w:after="80"/>
       </w:pPr>
       <w:r>
-        <w:t>为什么有些卖点放在待核实清单？</w:t>
+        <w:t>怎么调用</w:t>
       </w:r>
     </w:p>
     <w:p>
+      <w:pPr>
+        <w:spacing w:after="80" w:line="259" w:lineRule="auto"/>
+      </w:pPr>
       <w:r>
-        <w:t>因为竞品写了不代表我们的产品也有。比如 quick-dry、non-toxic、waterproof、certified、BPA-free 都必须有资料支持。</w:t>
+        <w:t>最简单的话术：</w:t>
       </w:r>
     </w:p>
     <w:p>
       <w:pPr>
-        <w:pStyle w:val="Heading2"/>
+        <w:pStyle w:val="CodeBlock"/>
+        <w:keepLines/>
       </w:pPr>
       <w:r>
-        <w:t>能不能直接复制英文上架？</w:t>
+        <w:t>用 amazon-listing-auto-copywriter，产品是荧光笔</w:t>
       </w:r>
     </w:p>
     <w:p>
+      <w:pPr>
+        <w:spacing w:after="80" w:line="259" w:lineRule="auto"/>
+      </w:pPr>
       <w:r>
-        <w:t>建议运营复核后再上架。英文主文案是强转化候选稿，不是免审核终稿。</w:t>
+        <w:t>如果要指定站点：</w:t>
       </w:r>
     </w:p>
     <w:p>
       <w:pPr>
-        <w:pStyle w:val="Heading2"/>
+        <w:pStyle w:val="CodeBlock"/>
+        <w:keepLines/>
       </w:pPr>
       <w:r>
-        <w:t>如果 Codex 只随便写了一段文案怎么办？</w:t>
+        <w:t>用 amazon-listing-auto-copywriter，产品是荧光笔，美国站</w:t>
       </w:r>
     </w:p>
     <w:p>
+      <w:pPr>
+        <w:pStyle w:val="CodeBlock"/>
+        <w:keepLines/>
+      </w:pPr>
       <w:r>
-        <w:t>说明可能没有正确触发 skill。重新输入“用 amazon-listing-auto-copywriter，产品是……”并检查输出里是否有竞品抓取依据。</w:t>
+        <w:t>用 amazon-listing-auto-copywriter，产品是婴儿围栏，加拿大站</w:t>
       </w:r>
     </w:p>
     <w:p>
       <w:pPr>
-        <w:sectPr>
-          <w:footerReference w:type="default" r:id="rId9"/>
-          <w:pgSz w:w="12240" w:h="15840"/>
-          <w:pgMar w:top="1224" w:right="1224" w:bottom="1224" w:left="1224" w:header="504" w:footer="504" w:gutter="0"/>
-          <w:cols w:space="720"/>
-          <w:docGrid w:linePitch="360"/>
-        </w:sectPr>
-      </w:pPr>
+        <w:pStyle w:val="CodeBlock"/>
+        <w:keepLines/>
+      </w:pPr>
+      <w:r>
+        <w:t>用 amazon-listing-auto-copywriter，产品是儿童显微镜，英国站</w:t>
+      </w:r>
     </w:p>
     <w:p>
       <w:pPr>
-        <w:pStyle w:val="Heading1"/>
+        <w:pStyle w:val="CodeBlock"/>
+        <w:keepLines/>
       </w:pPr>
       <w:r>
-        <w:t>附录：可复制话术</w:t>
+        <w:t>用 amazon-listing-auto-copywriter，产品是荧光笔，德国站</w:t>
       </w:r>
     </w:p>
-    <w:tbl>
-      <w:tblPr>
-        <w:tblW w:type="auto" w:w="0"/>
-        <w:jc w:val="left"/>
-        <w:tblLook w:firstColumn="1" w:firstRow="1" w:lastColumn="0" w:lastRow="0" w:noHBand="0" w:noVBand="1" w:val="04A0"/>
-      </w:tblPr>
-      <w:tblGrid>
-        <w:gridCol w:w="9792"/>
-      </w:tblGrid>
-      <w:tr>
-        <w:tc>
-          <w:tcPr>
-            <w:tcW w:type="dxa" w:w="9792"/>
-            <w:shd w:fill="F7F7F7"/>
-            <w:tcBorders>
-              <w:top w:val="single" w:sz="4" w:space="0" w:color="D1D5DB"/>
-              <w:left w:val="single" w:sz="4" w:space="0" w:color="D1D5DB"/>
-              <w:bottom w:val="single" w:sz="4" w:space="0" w:color="D1D5DB"/>
-              <w:right w:val="single" w:sz="4" w:space="0" w:color="D1D5DB"/>
-            </w:tcBorders>
-            <w:tcMar>
-              <w:top w:w="140" w:type="dxa"/>
-              <w:start w:w="180" w:type="dxa"/>
-              <w:bottom w:w="140" w:type="dxa"/>
-              <w:end w:w="180" w:type="dxa"/>
-            </w:tcMar>
-          </w:tcPr>
-          <w:p>
-            <w:pPr>
-              <w:spacing w:after="0"/>
-            </w:pPr>
-            <w:r>
-              <w:rPr>
-                <w:rFonts w:ascii="Consolas" w:hAnsi="Consolas" w:eastAsia="Consolas"/>
-                <w:color w:val="111827"/>
-                <w:sz w:val="19"/>
-              </w:rPr>
-              <w:t>用 amazon-listing-auto-copywriter，产品是【产品名】，美国站。</w:t>
-            </w:r>
-          </w:p>
-          <w:p>
-            <w:pPr>
-              <w:spacing w:after="0"/>
-            </w:pPr>
-            <w:r>
-              <w:rPr>
-                <w:rFonts w:ascii="Consolas" w:hAnsi="Consolas" w:eastAsia="Consolas"/>
-                <w:color w:val="111827"/>
-                <w:sz w:val="19"/>
-              </w:rPr>
-              <w:t>已知信息：</w:t>
-            </w:r>
-          </w:p>
-          <w:p>
-            <w:pPr>
-              <w:spacing w:after="0"/>
-            </w:pPr>
-            <w:r>
-              <w:rPr>
-                <w:rFonts w:ascii="Consolas" w:hAnsi="Consolas" w:eastAsia="Consolas"/>
-                <w:color w:val="111827"/>
-                <w:sz w:val="19"/>
-              </w:rPr>
-              <w:t>- 【数量/尺寸/颜色/材质】</w:t>
-            </w:r>
-          </w:p>
-          <w:p>
-            <w:pPr>
-              <w:spacing w:after="0"/>
-            </w:pPr>
-            <w:r>
-              <w:rPr>
-                <w:rFonts w:ascii="Consolas" w:hAnsi="Consolas" w:eastAsia="Consolas"/>
-                <w:color w:val="111827"/>
-                <w:sz w:val="19"/>
-              </w:rPr>
-              <w:t>- 【核心功能】</w:t>
-            </w:r>
-          </w:p>
-          <w:p>
-            <w:pPr>
-              <w:spacing w:after="0"/>
-            </w:pPr>
-            <w:r>
-              <w:rPr>
-                <w:rFonts w:ascii="Consolas" w:hAnsi="Consolas" w:eastAsia="Consolas"/>
-                <w:color w:val="111827"/>
-                <w:sz w:val="19"/>
-              </w:rPr>
-              <w:t>- 【使用场景】</w:t>
-            </w:r>
-          </w:p>
-          <w:p>
-            <w:pPr>
-              <w:spacing w:after="0"/>
-            </w:pPr>
-            <w:r>
-              <w:rPr>
-                <w:rFonts w:ascii="Consolas" w:hAnsi="Consolas" w:eastAsia="Consolas"/>
-                <w:color w:val="111827"/>
-                <w:sz w:val="19"/>
-              </w:rPr>
-              <w:t>- 【目标人群】</w:t>
-            </w:r>
-          </w:p>
-          <w:p>
-            <w:pPr>
-              <w:spacing w:after="0"/>
-            </w:pPr>
-            <w:r>
-              <w:rPr>
-                <w:rFonts w:ascii="Consolas" w:hAnsi="Consolas" w:eastAsia="Consolas"/>
-                <w:color w:val="111827"/>
-                <w:sz w:val="19"/>
-              </w:rPr>
-              <w:t>不确定信息：</w:t>
-            </w:r>
-          </w:p>
-          <w:p>
-            <w:pPr>
-              <w:spacing w:after="0"/>
-            </w:pPr>
-            <w:r>
-              <w:rPr>
-                <w:rFonts w:ascii="Consolas" w:hAnsi="Consolas" w:eastAsia="Consolas"/>
-                <w:color w:val="111827"/>
-                <w:sz w:val="19"/>
-              </w:rPr>
-              <w:t>- 【不确定功能或认证】</w:t>
-            </w:r>
-          </w:p>
-          <w:p>
-            <w:pPr>
-              <w:spacing w:after="0"/>
-            </w:pPr>
-            <w:r>
-              <w:rPr>
-                <w:rFonts w:ascii="Consolas" w:hAnsi="Consolas" w:eastAsia="Consolas"/>
-                <w:color w:val="111827"/>
-                <w:sz w:val="19"/>
-              </w:rPr>
-              <w:t>- 【不确定配件或参数】</w:t>
-            </w:r>
-          </w:p>
-          <w:p>
-            <w:pPr>
-              <w:spacing w:after="0"/>
-            </w:pPr>
-            <w:r>
-              <w:rPr>
-                <w:rFonts w:ascii="Consolas" w:hAnsi="Consolas" w:eastAsia="Consolas"/>
-                <w:color w:val="111827"/>
-                <w:sz w:val="19"/>
-              </w:rPr>
-              <w:t>要求：</w:t>
-            </w:r>
-          </w:p>
-          <w:p>
-            <w:pPr>
-              <w:spacing w:after="0"/>
-            </w:pPr>
-            <w:r>
-              <w:rPr>
-                <w:rFonts w:ascii="Consolas" w:hAnsi="Consolas" w:eastAsia="Consolas"/>
-                <w:color w:val="111827"/>
-                <w:sz w:val="19"/>
-              </w:rPr>
-              <w:t>- 英文主文案按美国本土 Amazon Listing 语感写</w:t>
-            </w:r>
-          </w:p>
-          <w:p>
-            <w:pPr>
-              <w:spacing w:after="0"/>
-            </w:pPr>
-            <w:r>
-              <w:rPr>
-                <w:rFonts w:ascii="Consolas" w:hAnsi="Consolas" w:eastAsia="Consolas"/>
-                <w:color w:val="111827"/>
-                <w:sz w:val="19"/>
-              </w:rPr>
-              <w:t>- 五点要有场景、痛点、功能支撑和结果感</w:t>
-            </w:r>
-          </w:p>
-          <w:p>
-            <w:pPr>
-              <w:spacing w:after="0"/>
-            </w:pPr>
-            <w:r>
-              <w:rPr>
-                <w:rFonts w:ascii="Consolas" w:hAnsi="Consolas" w:eastAsia="Consolas"/>
-                <w:color w:val="111827"/>
-                <w:sz w:val="19"/>
-              </w:rPr>
-              <w:t>- 中文对照逐句完整翻译</w:t>
-            </w:r>
-          </w:p>
-          <w:p>
-            <w:pPr>
-              <w:spacing w:after="0"/>
-            </w:pPr>
-            <w:r>
-              <w:rPr>
-                <w:rFonts w:ascii="Consolas" w:hAnsi="Consolas" w:eastAsia="Consolas"/>
-                <w:color w:val="111827"/>
-                <w:sz w:val="19"/>
-              </w:rPr>
-              <w:t>- 未核实内容放中文运营复核区</w:t>
-            </w:r>
-          </w:p>
-        </w:tc>
-      </w:tr>
-    </w:tbl>
+    <w:p>
+      <w:pPr>
+        <w:spacing w:after="80" w:line="259" w:lineRule="auto"/>
+      </w:pPr>
+      <w:r>
+        <w:t>如果你有产品资料，建议这样写：</w:t>
+      </w:r>
+    </w:p>
+    <w:p>
+      <w:pPr>
+        <w:pStyle w:val="CodeBlock"/>
+        <w:keepLines/>
+      </w:pPr>
+      <w:r>
+        <w:t>用 amazon-listing-auto-copywriter，产品是荧光笔，美国站。</w:t>
+        <w:br/>
+        <w:t>已知信息：</w:t>
+        <w:br/>
+        <w:t>- 8支装</w:t>
+        <w:br/>
+        <w:t>- 多色</w:t>
+        <w:br/>
+        <w:t>- 斜头</w:t>
+        <w:br/>
+        <w:t>- 适合学生、教师、办公室、手账</w:t>
+        <w:br/>
+        <w:t>- 不确定是否速干、不确定是否无毒</w:t>
+      </w:r>
+    </w:p>
+    <w:p>
+      <w:pPr>
+        <w:pStyle w:val="Heading1"/>
+        <w:spacing w:before="200" w:after="80"/>
+      </w:pPr>
+      <w:r>
+        <w:t>建议提供哪些产品信息</w:t>
+      </w:r>
+    </w:p>
+    <w:p>
+      <w:pPr>
+        <w:spacing w:after="80" w:line="259" w:lineRule="auto"/>
+      </w:pPr>
+      <w:r>
+        <w:t>信息越多，文案越准。能提供多少就提供多少：</w:t>
+      </w:r>
+    </w:p>
+    <w:p>
+      <w:pPr>
+        <w:pStyle w:val="CodeBlock"/>
+        <w:keepLines/>
+      </w:pPr>
+      <w:r>
+        <w:t>产品名：</w:t>
+        <w:br/>
+        <w:t>站点：美国站 / 加拿大站 / 英国站 / 德国站</w:t>
+        <w:br/>
+        <w:t>数量：</w:t>
+        <w:br/>
+        <w:t>颜色：</w:t>
+        <w:br/>
+        <w:t>尺寸：</w:t>
+        <w:br/>
+        <w:t>材质：</w:t>
+        <w:br/>
+        <w:t>核心功能：</w:t>
+        <w:br/>
+        <w:t>适用人群：</w:t>
+        <w:br/>
+        <w:t>使用场景：</w:t>
+        <w:br/>
+        <w:t>包装内包含什么：</w:t>
+        <w:br/>
+        <w:t>确认可以写的认证或测试：</w:t>
+        <w:br/>
+        <w:t>不能确定、不要乱写的信息：</w:t>
+      </w:r>
+    </w:p>
+    <w:p>
+      <w:pPr>
+        <w:spacing w:after="80" w:line="259" w:lineRule="auto"/>
+      </w:pPr>
+      <w:r>
+        <w:t>示例：</w:t>
+      </w:r>
+    </w:p>
+    <w:p>
+      <w:pPr>
+        <w:pStyle w:val="CodeBlock"/>
+        <w:keepLines/>
+      </w:pPr>
+      <w:r>
+        <w:t>用 amazon-listing-auto-copywriter，产品是儿童显微镜，美国站。</w:t>
+        <w:br/>
+        <w:t>已知信息：</w:t>
+        <w:br/>
+        <w:t>- 适合儿童科学启蒙</w:t>
+        <w:br/>
+        <w:t>- 配收纳盒</w:t>
+        <w:br/>
+        <w:t>- 有LED灯</w:t>
+        <w:br/>
+        <w:t>- 倍率不确定</w:t>
+        <w:br/>
+        <w:t>- 是否适合具体年龄段不确定</w:t>
+        <w:br/>
+        <w:t>- 不要写STEM认证</w:t>
+      </w:r>
+    </w:p>
+    <w:p>
+      <w:pPr>
+        <w:pStyle w:val="Heading1"/>
+        <w:spacing w:before="200" w:after="80"/>
+      </w:pPr>
+      <w:r>
+        <w:t>输出结果怎么看</w:t>
+      </w:r>
+    </w:p>
+    <w:p>
+      <w:pPr>
+        <w:spacing w:after="80" w:line="259" w:lineRule="auto"/>
+      </w:pPr>
+      <w:r>
+        <w:t>默认输出分三块。</w:t>
+      </w:r>
+    </w:p>
+    <w:p>
+      <w:pPr>
+        <w:pStyle w:val="Heading2"/>
+        <w:spacing w:before="140" w:after="60"/>
+      </w:pPr>
+      <w:r>
+        <w:t>1. Amazon Copy - Enhanced Candidate Version</w:t>
+      </w:r>
+    </w:p>
+    <w:p>
+      <w:pPr>
+        <w:spacing w:after="80" w:line="259" w:lineRule="auto"/>
+      </w:pPr>
+      <w:r>
+        <w:t>这是主文案区，可给运营复制修改。</w:t>
+      </w:r>
+    </w:p>
+    <w:p>
+      <w:pPr>
+        <w:spacing w:after="80" w:line="259" w:lineRule="auto"/>
+      </w:pPr>
+      <w:r>
+        <w:t>包括：</w:t>
+      </w:r>
+    </w:p>
+    <w:p>
+      <w:pPr>
+        <w:pStyle w:val="ListBullet"/>
+        <w:spacing w:after="30"/>
+      </w:pPr>
+      <w:r>
+        <w:t>Product Title</w:t>
+      </w:r>
+    </w:p>
+    <w:p>
+      <w:pPr>
+        <w:pStyle w:val="ListBullet"/>
+        <w:spacing w:after="30"/>
+      </w:pPr>
+      <w:r>
+        <w:t>5 Bullet Points</w:t>
+      </w:r>
+    </w:p>
+    <w:p>
+      <w:pPr>
+        <w:pStyle w:val="ListBullet"/>
+        <w:spacing w:after="30"/>
+      </w:pPr>
+      <w:r>
+        <w:t>Product Description</w:t>
+      </w:r>
+    </w:p>
+    <w:p>
+      <w:pPr>
+        <w:pStyle w:val="ListBullet"/>
+        <w:spacing w:after="30"/>
+      </w:pPr>
+      <w:r>
+        <w:t>Backend Search Terms</w:t>
+      </w:r>
+    </w:p>
+    <w:p>
+      <w:pPr>
+        <w:spacing w:after="80" w:line="259" w:lineRule="auto"/>
+      </w:pPr>
+      <w:r>
+        <w:t>美国站、加拿大站、英国站会输出英文；德国站会输出德文。主文案区不会混中文，也不会出现 `[待核实]`。</w:t>
+      </w:r>
+    </w:p>
+    <w:p>
+      <w:pPr>
+        <w:pStyle w:val="Heading2"/>
+        <w:spacing w:before="140" w:after="60"/>
+      </w:pPr>
+      <w:r>
+        <w:t>2. 中文文案对照</w:t>
+      </w:r>
+    </w:p>
+    <w:p>
+      <w:pPr>
+        <w:spacing w:after="80" w:line="259" w:lineRule="auto"/>
+      </w:pPr>
+      <w:r>
+        <w:t>这是给运营看的中文翻译。</w:t>
+      </w:r>
+    </w:p>
+    <w:p>
+      <w:pPr>
+        <w:spacing w:after="80" w:line="259" w:lineRule="auto"/>
+      </w:pPr>
+      <w:r>
+        <w:t>要求是一对一翻译主文案内容：</w:t>
+      </w:r>
+    </w:p>
+    <w:p>
+      <w:pPr>
+        <w:pStyle w:val="ListBullet"/>
+        <w:spacing w:after="30"/>
+      </w:pPr>
+      <w:r>
+        <w:t>主文案标题对应中文标题</w:t>
+      </w:r>
+    </w:p>
+    <w:p>
+      <w:pPr>
+        <w:pStyle w:val="ListBullet"/>
+        <w:spacing w:after="30"/>
+      </w:pPr>
+      <w:r>
+        <w:t>主文案五点逐条对应中文五点</w:t>
+      </w:r>
+    </w:p>
+    <w:p>
+      <w:pPr>
+        <w:pStyle w:val="ListBullet"/>
+        <w:spacing w:after="30"/>
+      </w:pPr>
+      <w:r>
+        <w:t>主文案描述完整翻译</w:t>
+      </w:r>
+    </w:p>
+    <w:p>
+      <w:pPr>
+        <w:pStyle w:val="ListBullet"/>
+        <w:spacing w:after="30"/>
+      </w:pPr>
+      <w:r>
+        <w:t>后台搜索词翻译成中文含义</w:t>
+      </w:r>
+    </w:p>
+    <w:p>
+      <w:pPr>
+        <w:spacing w:after="80" w:line="259" w:lineRule="auto"/>
+      </w:pPr>
+      <w:r>
+        <w:t>这部分不是给 Amazon 复制的。</w:t>
+      </w:r>
+    </w:p>
+    <w:p>
+      <w:pPr>
+        <w:pStyle w:val="Heading2"/>
+        <w:spacing w:before="140" w:after="60"/>
+      </w:pPr>
+      <w:r>
+        <w:t>3. 中文运营复核区</w:t>
+      </w:r>
+    </w:p>
+    <w:p>
+      <w:pPr>
+        <w:spacing w:after="80" w:line="259" w:lineRule="auto"/>
+      </w:pPr>
+      <w:r>
+        <w:t>这是运营必须看的地方。</w:t>
+      </w:r>
+    </w:p>
+    <w:p>
+      <w:pPr>
+        <w:spacing w:after="80" w:line="259" w:lineRule="auto"/>
+      </w:pPr>
+      <w:r>
+        <w:t>重点看：</w:t>
+      </w:r>
+    </w:p>
+    <w:p>
+      <w:pPr>
+        <w:pStyle w:val="ListBullet"/>
+        <w:spacing w:after="30"/>
+      </w:pPr>
+      <w:r>
+        <w:t>竞品抓取依据：用了哪些 ASIN，销量热度、BSR、评分、评论、图片数如何</w:t>
+      </w:r>
+    </w:p>
+    <w:p>
+      <w:pPr>
+        <w:pStyle w:val="ListBullet"/>
+        <w:spacing w:after="30"/>
+      </w:pPr>
+      <w:r>
+        <w:t>查询词依据：Codex 为这个站点生成了哪些当地买家搜索词</w:t>
+      </w:r>
+    </w:p>
+    <w:p>
+      <w:pPr>
+        <w:pStyle w:val="ListBullet"/>
+        <w:spacing w:after="30"/>
+      </w:pPr>
+      <w:r>
+        <w:t>竞品洞察：竞品都在怎么写</w:t>
+      </w:r>
+    </w:p>
+    <w:p>
+      <w:pPr>
+        <w:pStyle w:val="ListBullet"/>
+        <w:spacing w:after="30"/>
+      </w:pPr>
+      <w:r>
+        <w:t>关键词池：哪些词值得参考</w:t>
+      </w:r>
+    </w:p>
+    <w:p>
+      <w:pPr>
+        <w:pStyle w:val="ListBullet"/>
+        <w:spacing w:after="30"/>
+      </w:pPr>
+      <w:r>
+        <w:t>待核实清单：哪些功能、尺寸、材质、认证不能直接相信</w:t>
+      </w:r>
+    </w:p>
+    <w:p>
+      <w:pPr>
+        <w:pStyle w:val="ListBullet"/>
+        <w:spacing w:after="30"/>
+      </w:pPr>
+      <w:r>
+        <w:t>合规风险：哪些词不能乱写</w:t>
+      </w:r>
+    </w:p>
+    <w:p>
+      <w:pPr>
+        <w:pStyle w:val="Heading1"/>
+        <w:spacing w:before="200" w:after="80"/>
+      </w:pPr>
+      <w:r>
+        <w:t>运营复核重点</w:t>
+      </w:r>
+    </w:p>
+    <w:p>
+      <w:pPr>
+        <w:spacing w:after="80" w:line="259" w:lineRule="auto"/>
+      </w:pPr>
+      <w:r>
+        <w:t>生成结果不是直接无脑上架。运营至少要核对：</w:t>
+      </w:r>
+    </w:p>
+    <w:p>
+      <w:pPr>
+        <w:pStyle w:val="ListBullet"/>
+        <w:spacing w:after="30"/>
+      </w:pPr>
+      <w:r>
+        <w:t>尺寸是否真实</w:t>
+      </w:r>
+    </w:p>
+    <w:p>
+      <w:pPr>
+        <w:pStyle w:val="ListBullet"/>
+        <w:spacing w:after="30"/>
+      </w:pPr>
+      <w:r>
+        <w:t>数量是否真实</w:t>
+      </w:r>
+    </w:p>
+    <w:p>
+      <w:pPr>
+        <w:pStyle w:val="ListBullet"/>
+        <w:spacing w:after="30"/>
+      </w:pPr>
+      <w:r>
+        <w:t>颜色是否真实</w:t>
+      </w:r>
+    </w:p>
+    <w:p>
+      <w:pPr>
+        <w:pStyle w:val="ListBullet"/>
+        <w:spacing w:after="30"/>
+      </w:pPr>
+      <w:r>
+        <w:t>材质是否真实</w:t>
+      </w:r>
+    </w:p>
+    <w:p>
+      <w:pPr>
+        <w:pStyle w:val="ListBullet"/>
+        <w:spacing w:after="30"/>
+      </w:pPr>
+      <w:r>
+        <w:t>是否真的包含配件</w:t>
+      </w:r>
+    </w:p>
+    <w:p>
+      <w:pPr>
+        <w:pStyle w:val="ListBullet"/>
+        <w:spacing w:after="30"/>
+      </w:pPr>
+      <w:r>
+        <w:t>是否真的速干、防水、无毒、可水洗</w:t>
+      </w:r>
+    </w:p>
+    <w:p>
+      <w:pPr>
+        <w:pStyle w:val="ListBullet"/>
+        <w:spacing w:after="30"/>
+      </w:pPr>
+      <w:r>
+        <w:t>是否真的有认证</w:t>
+      </w:r>
+    </w:p>
+    <w:p>
+      <w:pPr>
+        <w:pStyle w:val="ListBullet"/>
+        <w:spacing w:after="30"/>
+      </w:pPr>
+      <w:r>
+        <w:t>年龄段是否能写</w:t>
+      </w:r>
+    </w:p>
+    <w:p>
+      <w:pPr>
+        <w:pStyle w:val="ListBullet"/>
+        <w:spacing w:after="30"/>
+      </w:pPr>
+      <w:r>
+        <w:t>是否涉及医疗、安全、儿童合规风险</w:t>
+      </w:r>
+    </w:p>
+    <w:p>
+      <w:pPr>
+        <w:spacing w:after="80" w:line="259" w:lineRule="auto"/>
+      </w:pPr>
+      <w:r>
+        <w:t>如果不能确认，就删掉或改弱。</w:t>
+      </w:r>
+    </w:p>
+    <w:p>
+      <w:pPr>
+        <w:pStyle w:val="Heading1"/>
+        <w:spacing w:before="200" w:after="80"/>
+      </w:pPr>
+      <w:r>
+        <w:t>常用提示词模板</w:t>
+      </w:r>
+    </w:p>
+    <w:p>
+      <w:pPr>
+        <w:pStyle w:val="Heading2"/>
+        <w:spacing w:before="140" w:after="60"/>
+      </w:pPr>
+      <w:r>
+        <w:t>只有产品名</w:t>
+      </w:r>
+    </w:p>
+    <w:p>
+      <w:pPr>
+        <w:pStyle w:val="CodeBlock"/>
+        <w:keepLines/>
+      </w:pPr>
+      <w:r>
+        <w:t>用 amazon-listing-auto-copywriter，产品是【产品名】，美国站</w:t>
+      </w:r>
+    </w:p>
+    <w:p>
+      <w:pPr>
+        <w:pStyle w:val="Heading2"/>
+        <w:spacing w:before="140" w:after="60"/>
+      </w:pPr>
+      <w:r>
+        <w:t>有基础参数</w:t>
+      </w:r>
+    </w:p>
+    <w:p>
+      <w:pPr>
+        <w:pStyle w:val="CodeBlock"/>
+        <w:keepLines/>
+      </w:pPr>
+      <w:r>
+        <w:t>用 amazon-listing-auto-copywriter，产品是【产品名】，美国站。</w:t>
+        <w:br/>
+        <w:t>已知信息：</w:t>
+        <w:br/>
+        <w:t>- 【参数1】</w:t>
+        <w:br/>
+        <w:t>- 【参数2】</w:t>
+        <w:br/>
+        <w:t>- 【参数3】</w:t>
+        <w:br/>
+        <w:t>不确定信息：</w:t>
+        <w:br/>
+        <w:t>- 【不确定1】</w:t>
+        <w:br/>
+        <w:t>- 【不确定2】</w:t>
+      </w:r>
+    </w:p>
+    <w:p>
+      <w:pPr>
+        <w:pStyle w:val="Heading2"/>
+        <w:spacing w:before="140" w:after="60"/>
+      </w:pPr>
+      <w:r>
+        <w:t>想让文案更像美国本土 Listing</w:t>
+      </w:r>
+    </w:p>
+    <w:p>
+      <w:pPr>
+        <w:pStyle w:val="CodeBlock"/>
+        <w:keepLines/>
+      </w:pPr>
+      <w:r>
+        <w:t>用 amazon-listing-auto-copywriter，产品是【产品名】，美国站。</w:t>
+        <w:br/>
+        <w:t>请按美国本土 Amazon Listing 语感写，五点要有场景、痛点、功能支撑和结果感。</w:t>
+        <w:br/>
+        <w:t>中文对照要逐句完整翻译。</w:t>
+      </w:r>
+    </w:p>
+    <w:p>
+      <w:pPr>
+        <w:pStyle w:val="Heading2"/>
+        <w:spacing w:before="140" w:after="60"/>
+      </w:pPr>
+      <w:r>
+        <w:t>想做英国站</w:t>
+      </w:r>
+    </w:p>
+    <w:p>
+      <w:pPr>
+        <w:pStyle w:val="CodeBlock"/>
+        <w:keepLines/>
+      </w:pPr>
+      <w:r>
+        <w:t>用 amazon-listing-auto-copywriter，产品是【产品名】，英国站。</w:t>
+        <w:br/>
+        <w:t>请按英国 Amazon Listing 语感写，允许使用自然的英式表达。</w:t>
+        <w:br/>
+        <w:t>中文对照要逐句完整翻译。</w:t>
+      </w:r>
+    </w:p>
+    <w:p>
+      <w:pPr>
+        <w:pStyle w:val="Heading2"/>
+        <w:spacing w:before="140" w:after="60"/>
+      </w:pPr>
+      <w:r>
+        <w:t>想做德国站</w:t>
+      </w:r>
+    </w:p>
+    <w:p>
+      <w:pPr>
+        <w:pStyle w:val="CodeBlock"/>
+        <w:keepLines/>
+      </w:pPr>
+      <w:r>
+        <w:t>用 amazon-listing-auto-copywriter，产品是【产品名】，德国站。</w:t>
+        <w:br/>
+        <w:t>主文案用德语写。中文对照要逐句完整翻译。</w:t>
+      </w:r>
+    </w:p>
+    <w:p>
+      <w:pPr>
+        <w:pStyle w:val="Heading2"/>
+        <w:spacing w:before="140" w:after="60"/>
+      </w:pPr>
+      <w:r>
+        <w:t>想限制不要乱写</w:t>
+      </w:r>
+    </w:p>
+    <w:p>
+      <w:pPr>
+        <w:pStyle w:val="CodeBlock"/>
+        <w:keepLines/>
+      </w:pPr>
+      <w:r>
+        <w:t>用 amazon-listing-auto-copywriter，产品是【产品名】，美国站。</w:t>
+        <w:br/>
+        <w:t>以下内容没有资料支持，不要写进英文主文案：</w:t>
+        <w:br/>
+        <w:t>- non-toxic</w:t>
+        <w:br/>
+        <w:t>- waterproof</w:t>
+        <w:br/>
+        <w:t>- certified</w:t>
+        <w:br/>
+        <w:t>- safe for kids</w:t>
+        <w:br/>
+        <w:t>- BPA-free</w:t>
+      </w:r>
+    </w:p>
+    <w:p>
+      <w:pPr>
+        <w:pStyle w:val="Heading1"/>
+        <w:spacing w:before="200" w:after="80"/>
+      </w:pPr>
+      <w:r>
+        <w:t>怎么判断 Skill 成功触发</w:t>
+      </w:r>
+    </w:p>
+    <w:p>
+      <w:pPr>
+        <w:spacing w:after="80" w:line="259" w:lineRule="auto"/>
+      </w:pPr>
+      <w:r>
+        <w:t>如果成功触发，输出里通常会有：</w:t>
+      </w:r>
+    </w:p>
+    <w:p>
+      <w:pPr>
+        <w:pStyle w:val="CodeBlock"/>
+        <w:keepLines/>
+      </w:pPr>
+      <w:r>
+        <w:t>Amazon Copy - Enhanced Candidate Version</w:t>
+        <w:br/>
+        <w:t>中文文案对照</w:t>
+        <w:br/>
+        <w:t>中文运营复核区</w:t>
+      </w:r>
+    </w:p>
+    <w:p>
+      <w:pPr>
+        <w:spacing w:after="80" w:line="259" w:lineRule="auto"/>
+      </w:pPr>
+      <w:r>
+        <w:t>并且会看到竞品抓取依据表，里面有：</w:t>
+      </w:r>
+    </w:p>
+    <w:p>
+      <w:pPr>
+        <w:pStyle w:val="CodeBlock"/>
+        <w:keepLines/>
+      </w:pPr>
+      <w:r>
+        <w:t>ASIN</w:t>
+        <w:br/>
+        <w:t>Bought Past Month</w:t>
+        <w:br/>
+        <w:t>Best Sellers Rank</w:t>
+        <w:br/>
+        <w:t>Rating</w:t>
+        <w:br/>
+        <w:t>Reviews</w:t>
+        <w:br/>
+        <w:t>Images</w:t>
+      </w:r>
+    </w:p>
+    <w:p>
+      <w:pPr>
+        <w:spacing w:after="80" w:line="259" w:lineRule="auto"/>
+      </w:pPr>
+      <w:r>
+        <w:t>如果 Codex 只随便写了一段文案，没有竞品依据，说明没有正确触发或没有按流程跑。</w:t>
+      </w:r>
+    </w:p>
+    <w:p>
+      <w:pPr>
+        <w:pStyle w:val="Heading1"/>
+        <w:spacing w:before="200" w:after="80"/>
+      </w:pPr>
+      <w:r>
+        <w:t>常见问题</w:t>
+      </w:r>
+    </w:p>
+    <w:p>
+      <w:pPr>
+        <w:pStyle w:val="Heading2"/>
+        <w:spacing w:before="140" w:after="60"/>
+      </w:pPr>
+      <w:r>
+        <w:t>安装后为什么调用不出来</w:t>
+      </w:r>
+    </w:p>
+    <w:p>
+      <w:pPr>
+        <w:spacing w:after="80" w:line="259" w:lineRule="auto"/>
+      </w:pPr>
+      <w:r>
+        <w:t>先重启 Codex。</w:t>
+      </w:r>
+    </w:p>
+    <w:p>
+      <w:pPr>
+        <w:spacing w:after="80" w:line="259" w:lineRule="auto"/>
+      </w:pPr>
+      <w:r>
+        <w:t>如果还是不行，确认安装地址是否是：</w:t>
+      </w:r>
+    </w:p>
+    <w:p>
+      <w:pPr>
+        <w:pStyle w:val="CodeBlock"/>
+        <w:keepLines/>
+      </w:pPr>
+      <w:r>
+        <w:t>https://github.com/hejun6666/maimeng/tree/main/skills/amazon-listing-auto-copywriter</w:t>
+      </w:r>
+    </w:p>
+    <w:p>
+      <w:pPr>
+        <w:pStyle w:val="Heading2"/>
+        <w:spacing w:before="140" w:after="60"/>
+      </w:pPr>
+      <w:r>
+        <w:t>为什么有些卖点放在待核实清单</w:t>
+      </w:r>
+    </w:p>
+    <w:p>
+      <w:pPr>
+        <w:spacing w:after="80" w:line="259" w:lineRule="auto"/>
+      </w:pPr>
+      <w:r>
+        <w:t>因为竞品写了不代表我们的产品也有。比如 `quick-dry`、`non-toxic`、`waterproof`、`certified`、`BPA-free` 都必须有资料支持。</w:t>
+      </w:r>
+    </w:p>
+    <w:p>
+      <w:pPr>
+        <w:pStyle w:val="Heading2"/>
+        <w:spacing w:before="140" w:after="60"/>
+      </w:pPr>
+      <w:r>
+        <w:t>能不能直接复制英文上架</w:t>
+      </w:r>
+    </w:p>
+    <w:p>
+      <w:pPr>
+        <w:spacing w:after="80" w:line="259" w:lineRule="auto"/>
+      </w:pPr>
+      <w:r>
+        <w:t>建议运营复核后再上架。英文主文案是“强转化候选稿”，不是免审核终稿。</w:t>
+      </w:r>
+    </w:p>
+    <w:p>
+      <w:pPr>
+        <w:pStyle w:val="Heading2"/>
+        <w:spacing w:before="140" w:after="60"/>
+      </w:pPr>
+      <w:r>
+        <w:t>支持哪些站点</w:t>
+      </w:r>
+    </w:p>
+    <w:p>
+      <w:pPr>
+        <w:spacing w:after="80" w:line="259" w:lineRule="auto"/>
+      </w:pPr>
+      <w:r>
+        <w:t>默认支持：</w:t>
+      </w:r>
+    </w:p>
+    <w:p>
+      <w:pPr>
+        <w:pStyle w:val="ListBullet"/>
+        <w:spacing w:after="30"/>
+      </w:pPr>
+      <w:r>
+        <w:t>Amazon US</w:t>
+      </w:r>
+    </w:p>
+    <w:p>
+      <w:pPr>
+        <w:pStyle w:val="ListBullet"/>
+        <w:spacing w:after="30"/>
+      </w:pPr>
+      <w:r>
+        <w:t>Amazon CA</w:t>
+      </w:r>
+    </w:p>
+    <w:p>
+      <w:pPr>
+        <w:pStyle w:val="ListBullet"/>
+        <w:spacing w:after="30"/>
+      </w:pPr>
+      <w:r>
+        <w:t>Amazon UK</w:t>
+      </w:r>
+    </w:p>
+    <w:p>
+      <w:pPr>
+        <w:pStyle w:val="ListBullet"/>
+        <w:spacing w:after="30"/>
+      </w:pPr>
+      <w:r>
+        <w:t>Amazon DE</w:t>
+      </w:r>
+    </w:p>
+    <w:p>
+      <w:pPr>
+        <w:spacing w:after="80" w:line="259" w:lineRule="auto"/>
+      </w:pPr>
+      <w:r>
+        <w:t>不写站点时，默认美国站。</w:t>
+      </w:r>
+    </w:p>
     <w:sectPr>
+      <w:footerReference w:type="default" r:id="rId9"/>
       <w:pgSz w:w="12240" w:h="15840"/>
-      <w:pgMar w:top="1224" w:right="1224" w:bottom="1224" w:left="1224" w:header="504" w:footer="504" w:gutter="0"/>
+      <w:pgMar w:top="1080" w:right="1080" w:bottom="1080" w:left="1080" w:header="720" w:footer="720" w:gutter="0"/>
       <w:cols w:space="720"/>
       <w:docGrid w:linePitch="360"/>
     </w:sectPr>
@@ -2319,11 +1016,11 @@
     </w:pPr>
     <w:r>
       <w:rPr>
-        <w:rFonts w:ascii="Microsoft YaHei" w:hAnsi="Microsoft YaHei" w:eastAsia="Microsoft YaHei"/>
-        <w:color w:val="6B7280"/>
-        <w:sz w:val="17"/>
-      </w:rPr>
-      <w:t>迈萌 Codex Skills | Amazon Listing 自动文案 Skill 使用手册</w:t>
+        <w:rFonts w:ascii="Microsoft YaHei" w:hAnsi="Microsoft YaHei"/>
+        <w:color w:val="787878"/>
+        <w:sz w:val="16"/>
+      </w:rPr>
+      <w:t>Maimeng Codex Skills - Amazon Listing Skill Manual</w:t>
     </w:r>
   </w:p>
 </w:ftr>
@@ -2692,12 +1389,8 @@
     <w:name w:val="Normal"/>
     <w:qFormat/>
     <w:rsid w:val="00FC693F"/>
-    <w:pPr>
-      <w:spacing w:after="120" w:line="283" w:lineRule="auto"/>
-    </w:pPr>
     <w:rPr>
-      <w:rFonts w:ascii="Microsoft YaHei" w:hAnsi="Microsoft YaHei" w:eastAsia="Microsoft YaHei"/>
-      <w:color w:val="111827"/>
+      <w:rFonts w:ascii="Microsoft YaHei" w:hAnsi="Microsoft YaHei"/>
       <w:sz w:val="21"/>
     </w:rPr>
   </w:style>
@@ -2756,15 +1449,15 @@
     <w:pPr>
       <w:keepNext/>
       <w:keepLines/>
-      <w:spacing w:before="320" w:after="160"/>
+      <w:spacing w:before="480" w:after="0"/>
       <w:outlineLvl w:val="0"/>
     </w:pPr>
     <w:rPr>
-      <w:rFonts w:asciiTheme="majorHAnsi" w:eastAsiaTheme="majorEastAsia" w:hAnsiTheme="majorHAnsi" w:cstheme="majorBidi" w:ascii="Microsoft YaHei" w:hAnsi="Microsoft YaHei" w:eastAsia="Microsoft YaHei"/>
+      <w:rFonts w:asciiTheme="majorHAnsi" w:eastAsiaTheme="majorEastAsia" w:hAnsiTheme="majorHAnsi" w:cstheme="majorBidi" w:ascii="Microsoft YaHei" w:hAnsi="Microsoft YaHei"/>
       <w:b/>
       <w:bCs/>
       <w:color w:val="1F4E79"/>
-      <w:sz w:val="32"/>
+      <w:sz w:val="30"/>
       <w:szCs w:val="28"/>
     </w:rPr>
   </w:style>
@@ -2780,15 +1473,15 @@
     <w:pPr>
       <w:keepNext/>
       <w:keepLines/>
-      <w:spacing w:before="200" w:after="120"/>
+      <w:spacing w:before="200" w:after="0"/>
       <w:outlineLvl w:val="1"/>
     </w:pPr>
     <w:rPr>
-      <w:rFonts w:asciiTheme="majorHAnsi" w:eastAsiaTheme="majorEastAsia" w:hAnsiTheme="majorHAnsi" w:cstheme="majorBidi" w:ascii="Microsoft YaHei" w:hAnsi="Microsoft YaHei" w:eastAsia="Microsoft YaHei"/>
+      <w:rFonts w:asciiTheme="majorHAnsi" w:eastAsiaTheme="majorEastAsia" w:hAnsiTheme="majorHAnsi" w:cstheme="majorBidi" w:ascii="Microsoft YaHei" w:hAnsi="Microsoft YaHei"/>
       <w:b/>
       <w:bCs/>
-      <w:color w:val="1F4E79"/>
-      <w:sz w:val="26"/>
+      <w:color w:val="373737"/>
+      <w:sz w:val="25"/>
       <w:szCs w:val="26"/>
     </w:rPr>
   </w:style>
@@ -2804,15 +1497,14 @@
     <w:pPr>
       <w:keepNext/>
       <w:keepLines/>
-      <w:spacing w:before="160" w:after="80"/>
+      <w:spacing w:before="200" w:after="0"/>
       <w:outlineLvl w:val="2"/>
     </w:pPr>
     <w:rPr>
-      <w:rFonts w:asciiTheme="majorHAnsi" w:eastAsiaTheme="majorEastAsia" w:hAnsiTheme="majorHAnsi" w:cstheme="majorBidi" w:ascii="Microsoft YaHei" w:hAnsi="Microsoft YaHei" w:eastAsia="Microsoft YaHei"/>
+      <w:rFonts w:asciiTheme="majorHAnsi" w:eastAsiaTheme="majorEastAsia" w:hAnsiTheme="majorHAnsi" w:cstheme="majorBidi"/>
       <w:b/>
       <w:bCs/>
-      <w:color w:val="374151"/>
-      <w:sz w:val="23"/>
+      <w:color w:val="4F81BD" w:themeColor="accent1"/>
     </w:rPr>
   </w:style>
   <w:style w:type="paragraph" w:styleId="Heading4">
@@ -3050,11 +1742,11 @@
       <w:contextualSpacing/>
     </w:pPr>
     <w:rPr>
-      <w:rFonts w:asciiTheme="majorHAnsi" w:eastAsiaTheme="majorEastAsia" w:hAnsiTheme="majorHAnsi" w:cstheme="majorBidi"/>
+      <w:rFonts w:asciiTheme="majorHAnsi" w:eastAsiaTheme="majorEastAsia" w:hAnsiTheme="majorHAnsi" w:cstheme="majorBidi" w:ascii="Microsoft YaHei" w:hAnsi="Microsoft YaHei"/>
       <w:color w:val="17365D" w:themeColor="text2" w:themeShade="BF"/>
       <w:spacing w:val="5"/>
       <w:kern w:val="28"/>
-      <w:sz w:val="52"/>
+      <w:sz w:val="44"/>
       <w:szCs w:val="52"/>
     </w:rPr>
   </w:style>
@@ -3230,6 +1922,10 @@
       </w:numPr>
       <w:contextualSpacing/>
     </w:pPr>
+    <w:rPr>
+      <w:rFonts w:ascii="Microsoft YaHei" w:hAnsi="Microsoft YaHei"/>
+      <w:sz w:val="21"/>
+    </w:rPr>
   </w:style>
   <w:style w:type="paragraph" w:styleId="ListBullet2">
     <w:name w:val="List Bullet 2"/>
@@ -14383,6 +13079,17 @@
         <w:shd w:val="clear" w:color="auto" w:fill="FBCAA2" w:themeFill="accent6" w:themeFillTint="7F"/>
       </w:tcPr>
     </w:tblStylePr>
+  </w:style>
+  <w:style w:type="paragraph" w:customStyle="1" w:styleId="CodeBlock">
+    <w:name w:val="Code Block"/>
+    <w:pPr>
+      <w:spacing w:before="80" w:after="120"/>
+      <w:ind w:left="259" w:right="259"/>
+    </w:pPr>
+    <w:rPr>
+      <w:rFonts w:ascii="Consolas" w:hAnsi="Consolas"/>
+      <w:sz w:val="18"/>
+    </w:rPr>
   </w:style>
 </w:styles>
 </file>

</xml_diff>